<commit_message>
creo que ya lo termine
</commit_message>
<xml_diff>
--- a/Informe Final Métodos.docx
+++ b/Informe Final Métodos.docx
@@ -2373,6 +2373,1272 @@
     </w:p>
     <w:p>
       <w:pPr>
+        <w:spacing w:before="240" w:after="80" w:line="276" w:lineRule="auto"/>
+        <w:jc w:val="left"/>
+      </w:pPr>
+      <w:r>
+        <w:rPr>
+          <w:rFonts w:ascii="Arial" w:hAnsi="Arial"/>
+          <w:b/>
+          <w:i w:val="0"/>
+          <w:sz w:val="24"/>
+        </w:rPr>
+        <w:t>1.2. Análisis de Micro-movimientos (Therbligs)</w:t>
+      </w:r>
+    </w:p>
+    <w:p>
+      <w:pPr>
+        <w:spacing w:before="0" w:after="120" w:line="276" w:lineRule="auto"/>
+        <w:jc w:val="both"/>
+      </w:pPr>
+      <w:r>
+        <w:rPr>
+          <w:rFonts w:ascii="Arial" w:hAnsi="Arial"/>
+          <w:b w:val="0"/>
+          <w:i w:val="0"/>
+          <w:sz w:val="22"/>
+        </w:rPr>
+        <w:t>El análisis de micro-movimientos (Therbligs), formulado originalmente por Frank y Lillian Gilbreth, descompone la actividad manual en elementos básicos que describen las acciones físicas y cognitivas del operario. Mediante el pipeline de vision artificial de CronoGrulla (MediaPipe Holistic) y el clasificador SVM en tiempo real, se logró catalogar de forma objetiva la secuencia de micro-movimientos para cada una de las 10 tareas del primer procedimiento de plegado. La Tabla 2.1 sintetiza los Therbligs dominantes detectados para este proceso, categorizados según su naturaleza en Therbligs eficientes (agregan valor directo al avance de la operación).</w:t>
+      </w:r>
+    </w:p>
+    <w:tbl>
+      <w:tblPr>
+        <w:tblW w:type="auto" w:w="0"/>
+        <w:jc w:val="center"/>
+        <w:tblLook w:firstColumn="1" w:firstRow="1" w:lastColumn="0" w:lastRow="0" w:noHBand="0" w:noVBand="1" w:val="04A0"/>
+        <w:tblBorders>
+          <w:top w:val="single" w:sz="12" w:space="0" w:color="555555"/>
+          <w:bottom w:val="single" w:sz="12" w:space="0" w:color="555555"/>
+          <w:insideH w:val="single" w:sz="4" w:space="0" w:color="AAAAAA"/>
+          <w:left w:val="none"/>
+          <w:right w:val="none"/>
+          <w:insideV w:val="none"/>
+        </w:tblBorders>
+      </w:tblPr>
+      <w:tblGrid>
+        <w:gridCol w:w="2340"/>
+        <w:gridCol w:w="2340"/>
+        <w:gridCol w:w="2340"/>
+        <w:gridCol w:w="2340"/>
+      </w:tblGrid>
+      <w:tr>
+        <w:tc>
+          <w:tcPr>
+            <w:tcW w:type="dxa" w:w="2340"/>
+            <w:shd w:fill="F2F4F7"/>
+            <w:tcMar>
+              <w:top w:w="80" w:type="dxa"/>
+              <w:bottom w:w="80" w:type="dxa"/>
+              <w:left w:w="100" w:type="dxa"/>
+              <w:right w:w="100" w:type="dxa"/>
+            </w:tcMar>
+          </w:tcPr>
+          <w:p>
+            <w:pPr>
+              <w:jc w:val="center"/>
+            </w:pPr>
+            <w:r>
+              <w:rPr>
+                <w:rFonts w:ascii="Arial" w:hAnsi="Arial"/>
+                <w:b/>
+                <w:sz w:val="19"/>
+              </w:rPr>
+              <w:t>Paso / Elemento</w:t>
+            </w:r>
+          </w:p>
+        </w:tc>
+        <w:tc>
+          <w:tcPr>
+            <w:tcW w:type="dxa" w:w="2340"/>
+            <w:shd w:fill="F2F4F7"/>
+            <w:tcMar>
+              <w:top w:w="80" w:type="dxa"/>
+              <w:bottom w:w="80" w:type="dxa"/>
+              <w:left w:w="100" w:type="dxa"/>
+              <w:right w:w="100" w:type="dxa"/>
+            </w:tcMar>
+          </w:tcPr>
+          <w:p>
+            <w:pPr>
+              <w:jc w:val="center"/>
+            </w:pPr>
+            <w:r>
+              <w:rPr>
+                <w:rFonts w:ascii="Arial" w:hAnsi="Arial"/>
+                <w:b/>
+                <w:sz w:val="19"/>
+              </w:rPr>
+              <w:t>Actividad del Metodo</w:t>
+            </w:r>
+          </w:p>
+        </w:tc>
+        <w:tc>
+          <w:tcPr>
+            <w:tcW w:type="dxa" w:w="2340"/>
+            <w:shd w:fill="F2F4F7"/>
+            <w:tcMar>
+              <w:top w:w="80" w:type="dxa"/>
+              <w:bottom w:w="80" w:type="dxa"/>
+              <w:left w:w="100" w:type="dxa"/>
+              <w:right w:w="100" w:type="dxa"/>
+            </w:tcMar>
+          </w:tcPr>
+          <w:p>
+            <w:pPr>
+              <w:jc w:val="center"/>
+            </w:pPr>
+            <w:r>
+              <w:rPr>
+                <w:rFonts w:ascii="Arial" w:hAnsi="Arial"/>
+                <w:b/>
+                <w:sz w:val="19"/>
+              </w:rPr>
+              <w:t>Therblig Predominante</w:t>
+            </w:r>
+          </w:p>
+        </w:tc>
+        <w:tc>
+          <w:tcPr>
+            <w:tcW w:type="dxa" w:w="2340"/>
+            <w:shd w:fill="F2F4F7"/>
+            <w:tcMar>
+              <w:top w:w="80" w:type="dxa"/>
+              <w:bottom w:w="80" w:type="dxa"/>
+              <w:left w:w="100" w:type="dxa"/>
+              <w:right w:w="100" w:type="dxa"/>
+            </w:tcMar>
+          </w:tcPr>
+          <w:p>
+            <w:pPr>
+              <w:jc w:val="center"/>
+            </w:pPr>
+            <w:r>
+              <w:rPr>
+                <w:rFonts w:ascii="Arial" w:hAnsi="Arial"/>
+                <w:b/>
+                <w:sz w:val="19"/>
+              </w:rPr>
+              <w:t>Tipo de Therblig</w:t>
+            </w:r>
+          </w:p>
+        </w:tc>
+      </w:tr>
+      <w:tr>
+        <w:tc>
+          <w:tcPr>
+            <w:tcW w:type="dxa" w:w="2340"/>
+            <w:tcMar>
+              <w:top w:w="80" w:type="dxa"/>
+              <w:bottom w:w="80" w:type="dxa"/>
+              <w:left w:w="100" w:type="dxa"/>
+              <w:right w:w="100" w:type="dxa"/>
+            </w:tcMar>
+          </w:tcPr>
+          <w:p>
+            <w:pPr>
+              <w:jc w:val="center"/>
+            </w:pPr>
+            <w:r>
+              <w:rPr>
+                <w:rFonts w:ascii="Arial" w:hAnsi="Arial"/>
+                <w:sz w:val="18"/>
+              </w:rPr>
+              <w:t>Paso 1</w:t>
+            </w:r>
+          </w:p>
+        </w:tc>
+        <w:tc>
+          <w:tcPr>
+            <w:tcW w:type="dxa" w:w="2340"/>
+            <w:tcMar>
+              <w:top w:w="80" w:type="dxa"/>
+              <w:bottom w:w="80" w:type="dxa"/>
+              <w:left w:w="100" w:type="dxa"/>
+              <w:right w:w="100" w:type="dxa"/>
+            </w:tcMar>
+          </w:tcPr>
+          <w:p>
+            <w:pPr>
+              <w:jc w:val="left"/>
+            </w:pPr>
+            <w:r>
+              <w:rPr>
+                <w:rFonts w:ascii="Arial" w:hAnsi="Arial"/>
+                <w:sz w:val="18"/>
+              </w:rPr>
+              <w:t>Posicion inicial</w:t>
+            </w:r>
+          </w:p>
+        </w:tc>
+        <w:tc>
+          <w:tcPr>
+            <w:tcW w:type="dxa" w:w="2340"/>
+            <w:tcMar>
+              <w:top w:w="80" w:type="dxa"/>
+              <w:bottom w:w="80" w:type="dxa"/>
+              <w:left w:w="100" w:type="dxa"/>
+              <w:right w:w="100" w:type="dxa"/>
+            </w:tcMar>
+          </w:tcPr>
+          <w:p>
+            <w:pPr>
+              <w:jc w:val="left"/>
+            </w:pPr>
+            <w:r>
+              <w:rPr>
+                <w:rFonts w:ascii="Arial" w:hAnsi="Arial"/>
+                <w:sz w:val="18"/>
+              </w:rPr>
+              <w:t>🖐️ SOLTAR (Release - RL)</w:t>
+            </w:r>
+          </w:p>
+        </w:tc>
+        <w:tc>
+          <w:tcPr>
+            <w:tcW w:type="dxa" w:w="2340"/>
+            <w:tcMar>
+              <w:top w:w="80" w:type="dxa"/>
+              <w:bottom w:w="80" w:type="dxa"/>
+              <w:left w:w="100" w:type="dxa"/>
+              <w:right w:w="100" w:type="dxa"/>
+            </w:tcMar>
+          </w:tcPr>
+          <w:p>
+            <w:pPr>
+              <w:jc w:val="left"/>
+            </w:pPr>
+            <w:r>
+              <w:rPr>
+                <w:rFonts w:ascii="Arial" w:hAnsi="Arial"/>
+                <w:sz w:val="18"/>
+              </w:rPr>
+              <w:t>Eficiente</w:t>
+            </w:r>
+          </w:p>
+        </w:tc>
+      </w:tr>
+      <w:tr>
+        <w:tc>
+          <w:tcPr>
+            <w:tcW w:type="dxa" w:w="2340"/>
+            <w:tcMar>
+              <w:top w:w="80" w:type="dxa"/>
+              <w:bottom w:w="80" w:type="dxa"/>
+              <w:left w:w="100" w:type="dxa"/>
+              <w:right w:w="100" w:type="dxa"/>
+            </w:tcMar>
+            <w:shd w:fill="FAFAFA"/>
+          </w:tcPr>
+          <w:p>
+            <w:pPr>
+              <w:jc w:val="center"/>
+            </w:pPr>
+            <w:r>
+              <w:rPr>
+                <w:rFonts w:ascii="Arial" w:hAnsi="Arial"/>
+                <w:sz w:val="18"/>
+              </w:rPr>
+              <w:t>Paso 2</w:t>
+            </w:r>
+          </w:p>
+        </w:tc>
+        <w:tc>
+          <w:tcPr>
+            <w:tcW w:type="dxa" w:w="2340"/>
+            <w:tcMar>
+              <w:top w:w="80" w:type="dxa"/>
+              <w:bottom w:w="80" w:type="dxa"/>
+              <w:left w:w="100" w:type="dxa"/>
+              <w:right w:w="100" w:type="dxa"/>
+            </w:tcMar>
+            <w:shd w:fill="FAFAFA"/>
+          </w:tcPr>
+          <w:p>
+            <w:pPr>
+              <w:jc w:val="left"/>
+            </w:pPr>
+            <w:r>
+              <w:rPr>
+                <w:rFonts w:ascii="Arial" w:hAnsi="Arial"/>
+                <w:sz w:val="18"/>
+              </w:rPr>
+              <w:t>Doblar en diagonal</w:t>
+            </w:r>
+          </w:p>
+        </w:tc>
+        <w:tc>
+          <w:tcPr>
+            <w:tcW w:type="dxa" w:w="2340"/>
+            <w:tcMar>
+              <w:top w:w="80" w:type="dxa"/>
+              <w:bottom w:w="80" w:type="dxa"/>
+              <w:left w:w="100" w:type="dxa"/>
+              <w:right w:w="100" w:type="dxa"/>
+            </w:tcMar>
+            <w:shd w:fill="FAFAFA"/>
+          </w:tcPr>
+          <w:p>
+            <w:pPr>
+              <w:jc w:val="left"/>
+            </w:pPr>
+            <w:r>
+              <w:rPr>
+                <w:rFonts w:ascii="Arial" w:hAnsi="Arial"/>
+                <w:sz w:val="18"/>
+              </w:rPr>
+              <w:t>✊ COGER (Grasp - G)</w:t>
+            </w:r>
+          </w:p>
+        </w:tc>
+        <w:tc>
+          <w:tcPr>
+            <w:tcW w:type="dxa" w:w="2340"/>
+            <w:tcMar>
+              <w:top w:w="80" w:type="dxa"/>
+              <w:bottom w:w="80" w:type="dxa"/>
+              <w:left w:w="100" w:type="dxa"/>
+              <w:right w:w="100" w:type="dxa"/>
+            </w:tcMar>
+            <w:shd w:fill="FAFAFA"/>
+          </w:tcPr>
+          <w:p>
+            <w:pPr>
+              <w:jc w:val="left"/>
+            </w:pPr>
+            <w:r>
+              <w:rPr>
+                <w:rFonts w:ascii="Arial" w:hAnsi="Arial"/>
+                <w:sz w:val="18"/>
+              </w:rPr>
+              <w:t>Eficiente</w:t>
+            </w:r>
+          </w:p>
+        </w:tc>
+      </w:tr>
+      <w:tr>
+        <w:tc>
+          <w:tcPr>
+            <w:tcW w:type="dxa" w:w="2340"/>
+            <w:tcMar>
+              <w:top w:w="80" w:type="dxa"/>
+              <w:bottom w:w="80" w:type="dxa"/>
+              <w:left w:w="100" w:type="dxa"/>
+              <w:right w:w="100" w:type="dxa"/>
+            </w:tcMar>
+          </w:tcPr>
+          <w:p>
+            <w:pPr>
+              <w:jc w:val="center"/>
+            </w:pPr>
+            <w:r>
+              <w:rPr>
+                <w:rFonts w:ascii="Arial" w:hAnsi="Arial"/>
+                <w:sz w:val="18"/>
+              </w:rPr>
+              <w:t>Paso 3</w:t>
+            </w:r>
+          </w:p>
+        </w:tc>
+        <w:tc>
+          <w:tcPr>
+            <w:tcW w:type="dxa" w:w="2340"/>
+            <w:tcMar>
+              <w:top w:w="80" w:type="dxa"/>
+              <w:bottom w:w="80" w:type="dxa"/>
+              <w:left w:w="100" w:type="dxa"/>
+              <w:right w:w="100" w:type="dxa"/>
+            </w:tcMar>
+          </w:tcPr>
+          <w:p>
+            <w:pPr>
+              <w:jc w:val="left"/>
+            </w:pPr>
+            <w:r>
+              <w:rPr>
+                <w:rFonts w:ascii="Arial" w:hAnsi="Arial"/>
+                <w:sz w:val="18"/>
+              </w:rPr>
+              <w:t>Segundo doblez</w:t>
+            </w:r>
+          </w:p>
+        </w:tc>
+        <w:tc>
+          <w:tcPr>
+            <w:tcW w:type="dxa" w:w="2340"/>
+            <w:tcMar>
+              <w:top w:w="80" w:type="dxa"/>
+              <w:bottom w:w="80" w:type="dxa"/>
+              <w:left w:w="100" w:type="dxa"/>
+              <w:right w:w="100" w:type="dxa"/>
+            </w:tcMar>
+          </w:tcPr>
+          <w:p>
+            <w:pPr>
+              <w:jc w:val="left"/>
+            </w:pPr>
+            <w:r>
+              <w:rPr>
+                <w:rFonts w:ascii="Arial" w:hAnsi="Arial"/>
+                <w:sz w:val="18"/>
+              </w:rPr>
+              <w:t>✊ COGER (Grasp - G)</w:t>
+            </w:r>
+          </w:p>
+        </w:tc>
+        <w:tc>
+          <w:tcPr>
+            <w:tcW w:type="dxa" w:w="2340"/>
+            <w:tcMar>
+              <w:top w:w="80" w:type="dxa"/>
+              <w:bottom w:w="80" w:type="dxa"/>
+              <w:left w:w="100" w:type="dxa"/>
+              <w:right w:w="100" w:type="dxa"/>
+            </w:tcMar>
+          </w:tcPr>
+          <w:p>
+            <w:pPr>
+              <w:jc w:val="left"/>
+            </w:pPr>
+            <w:r>
+              <w:rPr>
+                <w:rFonts w:ascii="Arial" w:hAnsi="Arial"/>
+                <w:sz w:val="18"/>
+              </w:rPr>
+              <w:t>Eficiente</w:t>
+            </w:r>
+          </w:p>
+        </w:tc>
+      </w:tr>
+      <w:tr>
+        <w:tc>
+          <w:tcPr>
+            <w:tcW w:type="dxa" w:w="2340"/>
+            <w:tcMar>
+              <w:top w:w="80" w:type="dxa"/>
+              <w:bottom w:w="80" w:type="dxa"/>
+              <w:left w:w="100" w:type="dxa"/>
+              <w:right w:w="100" w:type="dxa"/>
+            </w:tcMar>
+            <w:shd w:fill="FAFAFA"/>
+          </w:tcPr>
+          <w:p>
+            <w:pPr>
+              <w:jc w:val="center"/>
+            </w:pPr>
+            <w:r>
+              <w:rPr>
+                <w:rFonts w:ascii="Arial" w:hAnsi="Arial"/>
+                <w:sz w:val="18"/>
+              </w:rPr>
+              <w:t>Paso 4</w:t>
+            </w:r>
+          </w:p>
+        </w:tc>
+        <w:tc>
+          <w:tcPr>
+            <w:tcW w:type="dxa" w:w="2340"/>
+            <w:tcMar>
+              <w:top w:w="80" w:type="dxa"/>
+              <w:bottom w:w="80" w:type="dxa"/>
+              <w:left w:w="100" w:type="dxa"/>
+              <w:right w:w="100" w:type="dxa"/>
+            </w:tcMar>
+            <w:shd w:fill="FAFAFA"/>
+          </w:tcPr>
+          <w:p>
+            <w:pPr>
+              <w:jc w:val="left"/>
+            </w:pPr>
+            <w:r>
+              <w:rPr>
+                <w:rFonts w:ascii="Arial" w:hAnsi="Arial"/>
+                <w:sz w:val="18"/>
+              </w:rPr>
+              <w:t>Formar la base</w:t>
+            </w:r>
+          </w:p>
+        </w:tc>
+        <w:tc>
+          <w:tcPr>
+            <w:tcW w:type="dxa" w:w="2340"/>
+            <w:tcMar>
+              <w:top w:w="80" w:type="dxa"/>
+              <w:bottom w:w="80" w:type="dxa"/>
+              <w:left w:w="100" w:type="dxa"/>
+              <w:right w:w="100" w:type="dxa"/>
+            </w:tcMar>
+            <w:shd w:fill="FAFAFA"/>
+          </w:tcPr>
+          <w:p>
+            <w:pPr>
+              <w:jc w:val="left"/>
+            </w:pPr>
+            <w:r>
+              <w:rPr>
+                <w:rFonts w:ascii="Arial" w:hAnsi="Arial"/>
+                <w:sz w:val="18"/>
+              </w:rPr>
+              <w:t>✊ COGER (Grasp - G)</w:t>
+            </w:r>
+          </w:p>
+        </w:tc>
+        <w:tc>
+          <w:tcPr>
+            <w:tcW w:type="dxa" w:w="2340"/>
+            <w:tcMar>
+              <w:top w:w="80" w:type="dxa"/>
+              <w:bottom w:w="80" w:type="dxa"/>
+              <w:left w:w="100" w:type="dxa"/>
+              <w:right w:w="100" w:type="dxa"/>
+            </w:tcMar>
+            <w:shd w:fill="FAFAFA"/>
+          </w:tcPr>
+          <w:p>
+            <w:pPr>
+              <w:jc w:val="left"/>
+            </w:pPr>
+            <w:r>
+              <w:rPr>
+                <w:rFonts w:ascii="Arial" w:hAnsi="Arial"/>
+                <w:sz w:val="18"/>
+              </w:rPr>
+              <w:t>Eficiente</w:t>
+            </w:r>
+          </w:p>
+        </w:tc>
+      </w:tr>
+      <w:tr>
+        <w:tc>
+          <w:tcPr>
+            <w:tcW w:type="dxa" w:w="2340"/>
+            <w:tcMar>
+              <w:top w:w="80" w:type="dxa"/>
+              <w:bottom w:w="80" w:type="dxa"/>
+              <w:left w:w="100" w:type="dxa"/>
+              <w:right w:w="100" w:type="dxa"/>
+            </w:tcMar>
+          </w:tcPr>
+          <w:p>
+            <w:pPr>
+              <w:jc w:val="center"/>
+            </w:pPr>
+            <w:r>
+              <w:rPr>
+                <w:rFonts w:ascii="Arial" w:hAnsi="Arial"/>
+                <w:sz w:val="18"/>
+              </w:rPr>
+              <w:t>Paso 5</w:t>
+            </w:r>
+          </w:p>
+        </w:tc>
+        <w:tc>
+          <w:tcPr>
+            <w:tcW w:type="dxa" w:w="2340"/>
+            <w:tcMar>
+              <w:top w:w="80" w:type="dxa"/>
+              <w:bottom w:w="80" w:type="dxa"/>
+              <w:left w:w="100" w:type="dxa"/>
+              <w:right w:w="100" w:type="dxa"/>
+            </w:tcMar>
+          </w:tcPr>
+          <w:p>
+            <w:pPr>
+              <w:jc w:val="left"/>
+            </w:pPr>
+            <w:r>
+              <w:rPr>
+                <w:rFonts w:ascii="Arial" w:hAnsi="Arial"/>
+                <w:sz w:val="18"/>
+              </w:rPr>
+              <w:t>Repetir del otro lado</w:t>
+            </w:r>
+          </w:p>
+        </w:tc>
+        <w:tc>
+          <w:tcPr>
+            <w:tcW w:type="dxa" w:w="2340"/>
+            <w:tcMar>
+              <w:top w:w="80" w:type="dxa"/>
+              <w:bottom w:w="80" w:type="dxa"/>
+              <w:left w:w="100" w:type="dxa"/>
+              <w:right w:w="100" w:type="dxa"/>
+            </w:tcMar>
+          </w:tcPr>
+          <w:p>
+            <w:pPr>
+              <w:jc w:val="left"/>
+            </w:pPr>
+            <w:r>
+              <w:rPr>
+                <w:rFonts w:ascii="Arial" w:hAnsi="Arial"/>
+                <w:sz w:val="18"/>
+              </w:rPr>
+              <w:t>✊ COGER (Grasp - G)</w:t>
+            </w:r>
+          </w:p>
+        </w:tc>
+        <w:tc>
+          <w:tcPr>
+            <w:tcW w:type="dxa" w:w="2340"/>
+            <w:tcMar>
+              <w:top w:w="80" w:type="dxa"/>
+              <w:bottom w:w="80" w:type="dxa"/>
+              <w:left w:w="100" w:type="dxa"/>
+              <w:right w:w="100" w:type="dxa"/>
+            </w:tcMar>
+          </w:tcPr>
+          <w:p>
+            <w:pPr>
+              <w:jc w:val="left"/>
+            </w:pPr>
+            <w:r>
+              <w:rPr>
+                <w:rFonts w:ascii="Arial" w:hAnsi="Arial"/>
+                <w:sz w:val="18"/>
+              </w:rPr>
+              <w:t>Eficiente</w:t>
+            </w:r>
+          </w:p>
+        </w:tc>
+      </w:tr>
+      <w:tr>
+        <w:tc>
+          <w:tcPr>
+            <w:tcW w:type="dxa" w:w="2340"/>
+            <w:tcMar>
+              <w:top w:w="80" w:type="dxa"/>
+              <w:bottom w:w="80" w:type="dxa"/>
+              <w:left w:w="100" w:type="dxa"/>
+              <w:right w:w="100" w:type="dxa"/>
+            </w:tcMar>
+            <w:shd w:fill="FAFAFA"/>
+          </w:tcPr>
+          <w:p>
+            <w:pPr>
+              <w:jc w:val="center"/>
+            </w:pPr>
+            <w:r>
+              <w:rPr>
+                <w:rFonts w:ascii="Arial" w:hAnsi="Arial"/>
+                <w:sz w:val="18"/>
+              </w:rPr>
+              <w:t>Paso 6</w:t>
+            </w:r>
+          </w:p>
+        </w:tc>
+        <w:tc>
+          <w:tcPr>
+            <w:tcW w:type="dxa" w:w="2340"/>
+            <w:tcMar>
+              <w:top w:w="80" w:type="dxa"/>
+              <w:bottom w:w="80" w:type="dxa"/>
+              <w:left w:w="100" w:type="dxa"/>
+              <w:right w:w="100" w:type="dxa"/>
+            </w:tcMar>
+            <w:shd w:fill="FAFAFA"/>
+          </w:tcPr>
+          <w:p>
+            <w:pPr>
+              <w:jc w:val="left"/>
+            </w:pPr>
+            <w:r>
+              <w:rPr>
+                <w:rFonts w:ascii="Arial" w:hAnsi="Arial"/>
+                <w:sz w:val="18"/>
+              </w:rPr>
+              <w:t>Formar una especie de pentagono</w:t>
+            </w:r>
+          </w:p>
+        </w:tc>
+        <w:tc>
+          <w:tcPr>
+            <w:tcW w:type="dxa" w:w="2340"/>
+            <w:tcMar>
+              <w:top w:w="80" w:type="dxa"/>
+              <w:bottom w:w="80" w:type="dxa"/>
+              <w:left w:w="100" w:type="dxa"/>
+              <w:right w:w="100" w:type="dxa"/>
+            </w:tcMar>
+            <w:shd w:fill="FAFAFA"/>
+          </w:tcPr>
+          <w:p>
+            <w:pPr>
+              <w:jc w:val="left"/>
+            </w:pPr>
+            <w:r>
+              <w:rPr>
+                <w:rFonts w:ascii="Arial" w:hAnsi="Arial"/>
+                <w:sz w:val="18"/>
+              </w:rPr>
+              <w:t>✊ COGER (Grasp - G)</w:t>
+            </w:r>
+          </w:p>
+        </w:tc>
+        <w:tc>
+          <w:tcPr>
+            <w:tcW w:type="dxa" w:w="2340"/>
+            <w:tcMar>
+              <w:top w:w="80" w:type="dxa"/>
+              <w:bottom w:w="80" w:type="dxa"/>
+              <w:left w:w="100" w:type="dxa"/>
+              <w:right w:w="100" w:type="dxa"/>
+            </w:tcMar>
+            <w:shd w:fill="FAFAFA"/>
+          </w:tcPr>
+          <w:p>
+            <w:pPr>
+              <w:jc w:val="left"/>
+            </w:pPr>
+            <w:r>
+              <w:rPr>
+                <w:rFonts w:ascii="Arial" w:hAnsi="Arial"/>
+                <w:sz w:val="18"/>
+              </w:rPr>
+              <w:t>Eficiente</w:t>
+            </w:r>
+          </w:p>
+        </w:tc>
+      </w:tr>
+      <w:tr>
+        <w:tc>
+          <w:tcPr>
+            <w:tcW w:type="dxa" w:w="2340"/>
+            <w:tcMar>
+              <w:top w:w="80" w:type="dxa"/>
+              <w:bottom w:w="80" w:type="dxa"/>
+              <w:left w:w="100" w:type="dxa"/>
+              <w:right w:w="100" w:type="dxa"/>
+            </w:tcMar>
+          </w:tcPr>
+          <w:p>
+            <w:pPr>
+              <w:jc w:val="center"/>
+            </w:pPr>
+            <w:r>
+              <w:rPr>
+                <w:rFonts w:ascii="Arial" w:hAnsi="Arial"/>
+                <w:sz w:val="18"/>
+              </w:rPr>
+              <w:t>Paso 7</w:t>
+            </w:r>
+          </w:p>
+        </w:tc>
+        <w:tc>
+          <w:tcPr>
+            <w:tcW w:type="dxa" w:w="2340"/>
+            <w:tcMar>
+              <w:top w:w="80" w:type="dxa"/>
+              <w:bottom w:w="80" w:type="dxa"/>
+              <w:left w:w="100" w:type="dxa"/>
+              <w:right w:w="100" w:type="dxa"/>
+            </w:tcMar>
+          </w:tcPr>
+          <w:p>
+            <w:pPr>
+              <w:jc w:val="left"/>
+            </w:pPr>
+            <w:r>
+              <w:rPr>
+                <w:rFonts w:ascii="Arial" w:hAnsi="Arial"/>
+                <w:sz w:val="18"/>
+              </w:rPr>
+              <w:t>Formar el cuerpo</w:t>
+            </w:r>
+          </w:p>
+        </w:tc>
+        <w:tc>
+          <w:tcPr>
+            <w:tcW w:type="dxa" w:w="2340"/>
+            <w:tcMar>
+              <w:top w:w="80" w:type="dxa"/>
+              <w:bottom w:w="80" w:type="dxa"/>
+              <w:left w:w="100" w:type="dxa"/>
+              <w:right w:w="100" w:type="dxa"/>
+            </w:tcMar>
+          </w:tcPr>
+          <w:p>
+            <w:pPr>
+              <w:jc w:val="left"/>
+            </w:pPr>
+            <w:r>
+              <w:rPr>
+                <w:rFonts w:ascii="Arial" w:hAnsi="Arial"/>
+                <w:sz w:val="18"/>
+              </w:rPr>
+              <w:t>✊ COGER (Grasp - G)</w:t>
+            </w:r>
+          </w:p>
+        </w:tc>
+        <w:tc>
+          <w:tcPr>
+            <w:tcW w:type="dxa" w:w="2340"/>
+            <w:tcMar>
+              <w:top w:w="80" w:type="dxa"/>
+              <w:bottom w:w="80" w:type="dxa"/>
+              <w:left w:w="100" w:type="dxa"/>
+              <w:right w:w="100" w:type="dxa"/>
+            </w:tcMar>
+          </w:tcPr>
+          <w:p>
+            <w:pPr>
+              <w:jc w:val="left"/>
+            </w:pPr>
+            <w:r>
+              <w:rPr>
+                <w:rFonts w:ascii="Arial" w:hAnsi="Arial"/>
+                <w:sz w:val="18"/>
+              </w:rPr>
+              <w:t>Eficiente</w:t>
+            </w:r>
+          </w:p>
+        </w:tc>
+      </w:tr>
+      <w:tr>
+        <w:tc>
+          <w:tcPr>
+            <w:tcW w:type="dxa" w:w="2340"/>
+            <w:tcMar>
+              <w:top w:w="80" w:type="dxa"/>
+              <w:bottom w:w="80" w:type="dxa"/>
+              <w:left w:w="100" w:type="dxa"/>
+              <w:right w:w="100" w:type="dxa"/>
+            </w:tcMar>
+            <w:shd w:fill="FAFAFA"/>
+          </w:tcPr>
+          <w:p>
+            <w:pPr>
+              <w:jc w:val="center"/>
+            </w:pPr>
+            <w:r>
+              <w:rPr>
+                <w:rFonts w:ascii="Arial" w:hAnsi="Arial"/>
+                <w:sz w:val="18"/>
+              </w:rPr>
+              <w:t>Paso 8</w:t>
+            </w:r>
+          </w:p>
+        </w:tc>
+        <w:tc>
+          <w:tcPr>
+            <w:tcW w:type="dxa" w:w="2340"/>
+            <w:tcMar>
+              <w:top w:w="80" w:type="dxa"/>
+              <w:bottom w:w="80" w:type="dxa"/>
+              <w:left w:w="100" w:type="dxa"/>
+              <w:right w:w="100" w:type="dxa"/>
+            </w:tcMar>
+            <w:shd w:fill="FAFAFA"/>
+          </w:tcPr>
+          <w:p>
+            <w:pPr>
+              <w:jc w:val="left"/>
+            </w:pPr>
+            <w:r>
+              <w:rPr>
+                <w:rFonts w:ascii="Arial" w:hAnsi="Arial"/>
+                <w:sz w:val="18"/>
+              </w:rPr>
+              <w:t>Formar el cuello</w:t>
+            </w:r>
+          </w:p>
+        </w:tc>
+        <w:tc>
+          <w:tcPr>
+            <w:tcW w:type="dxa" w:w="2340"/>
+            <w:tcMar>
+              <w:top w:w="80" w:type="dxa"/>
+              <w:bottom w:w="80" w:type="dxa"/>
+              <w:left w:w="100" w:type="dxa"/>
+              <w:right w:w="100" w:type="dxa"/>
+            </w:tcMar>
+            <w:shd w:fill="FAFAFA"/>
+          </w:tcPr>
+          <w:p>
+            <w:pPr>
+              <w:jc w:val="left"/>
+            </w:pPr>
+            <w:r>
+              <w:rPr>
+                <w:rFonts w:ascii="Arial" w:hAnsi="Arial"/>
+                <w:sz w:val="18"/>
+              </w:rPr>
+              <w:t>✊ COGER (Grasp - G)</w:t>
+            </w:r>
+          </w:p>
+        </w:tc>
+        <w:tc>
+          <w:tcPr>
+            <w:tcW w:type="dxa" w:w="2340"/>
+            <w:tcMar>
+              <w:top w:w="80" w:type="dxa"/>
+              <w:bottom w:w="80" w:type="dxa"/>
+              <w:left w:w="100" w:type="dxa"/>
+              <w:right w:w="100" w:type="dxa"/>
+            </w:tcMar>
+            <w:shd w:fill="FAFAFA"/>
+          </w:tcPr>
+          <w:p>
+            <w:pPr>
+              <w:jc w:val="left"/>
+            </w:pPr>
+            <w:r>
+              <w:rPr>
+                <w:rFonts w:ascii="Arial" w:hAnsi="Arial"/>
+                <w:sz w:val="18"/>
+              </w:rPr>
+              <w:t>Eficiente</w:t>
+            </w:r>
+          </w:p>
+        </w:tc>
+      </w:tr>
+      <w:tr>
+        <w:tc>
+          <w:tcPr>
+            <w:tcW w:type="dxa" w:w="2340"/>
+            <w:tcMar>
+              <w:top w:w="80" w:type="dxa"/>
+              <w:bottom w:w="80" w:type="dxa"/>
+              <w:left w:w="100" w:type="dxa"/>
+              <w:right w:w="100" w:type="dxa"/>
+            </w:tcMar>
+          </w:tcPr>
+          <w:p>
+            <w:pPr>
+              <w:jc w:val="center"/>
+            </w:pPr>
+            <w:r>
+              <w:rPr>
+                <w:rFonts w:ascii="Arial" w:hAnsi="Arial"/>
+                <w:sz w:val="18"/>
+              </w:rPr>
+              <w:t>Paso 9</w:t>
+            </w:r>
+          </w:p>
+        </w:tc>
+        <w:tc>
+          <w:tcPr>
+            <w:tcW w:type="dxa" w:w="2340"/>
+            <w:tcMar>
+              <w:top w:w="80" w:type="dxa"/>
+              <w:bottom w:w="80" w:type="dxa"/>
+              <w:left w:w="100" w:type="dxa"/>
+              <w:right w:w="100" w:type="dxa"/>
+            </w:tcMar>
+          </w:tcPr>
+          <w:p>
+            <w:pPr>
+              <w:jc w:val="left"/>
+            </w:pPr>
+            <w:r>
+              <w:rPr>
+                <w:rFonts w:ascii="Arial" w:hAnsi="Arial"/>
+                <w:sz w:val="18"/>
+              </w:rPr>
+              <w:t>Formar la cabeza</w:t>
+            </w:r>
+          </w:p>
+        </w:tc>
+        <w:tc>
+          <w:tcPr>
+            <w:tcW w:type="dxa" w:w="2340"/>
+            <w:tcMar>
+              <w:top w:w="80" w:type="dxa"/>
+              <w:bottom w:w="80" w:type="dxa"/>
+              <w:left w:w="100" w:type="dxa"/>
+              <w:right w:w="100" w:type="dxa"/>
+            </w:tcMar>
+          </w:tcPr>
+          <w:p>
+            <w:pPr>
+              <w:jc w:val="left"/>
+            </w:pPr>
+            <w:r>
+              <w:rPr>
+                <w:rFonts w:ascii="Arial" w:hAnsi="Arial"/>
+                <w:sz w:val="18"/>
+              </w:rPr>
+              <w:t>🖐️ SOLTAR (Release - RL)</w:t>
+            </w:r>
+          </w:p>
+        </w:tc>
+        <w:tc>
+          <w:tcPr>
+            <w:tcW w:type="dxa" w:w="2340"/>
+            <w:tcMar>
+              <w:top w:w="80" w:type="dxa"/>
+              <w:bottom w:w="80" w:type="dxa"/>
+              <w:left w:w="100" w:type="dxa"/>
+              <w:right w:w="100" w:type="dxa"/>
+            </w:tcMar>
+          </w:tcPr>
+          <w:p>
+            <w:pPr>
+              <w:jc w:val="left"/>
+            </w:pPr>
+            <w:r>
+              <w:rPr>
+                <w:rFonts w:ascii="Arial" w:hAnsi="Arial"/>
+                <w:sz w:val="18"/>
+              </w:rPr>
+              <w:t>Eficiente</w:t>
+            </w:r>
+          </w:p>
+        </w:tc>
+      </w:tr>
+      <w:tr>
+        <w:tc>
+          <w:tcPr>
+            <w:tcW w:type="dxa" w:w="2340"/>
+            <w:tcMar>
+              <w:top w:w="80" w:type="dxa"/>
+              <w:bottom w:w="80" w:type="dxa"/>
+              <w:left w:w="100" w:type="dxa"/>
+              <w:right w:w="100" w:type="dxa"/>
+            </w:tcMar>
+            <w:shd w:fill="FAFAFA"/>
+          </w:tcPr>
+          <w:p>
+            <w:pPr>
+              <w:jc w:val="center"/>
+            </w:pPr>
+            <w:r>
+              <w:rPr>
+                <w:rFonts w:ascii="Arial" w:hAnsi="Arial"/>
+                <w:sz w:val="18"/>
+              </w:rPr>
+              <w:t>Paso 10</w:t>
+            </w:r>
+          </w:p>
+        </w:tc>
+        <w:tc>
+          <w:tcPr>
+            <w:tcW w:type="dxa" w:w="2340"/>
+            <w:tcMar>
+              <w:top w:w="80" w:type="dxa"/>
+              <w:bottom w:w="80" w:type="dxa"/>
+              <w:left w:w="100" w:type="dxa"/>
+              <w:right w:w="100" w:type="dxa"/>
+            </w:tcMar>
+            <w:shd w:fill="FAFAFA"/>
+          </w:tcPr>
+          <w:p>
+            <w:pPr>
+              <w:jc w:val="left"/>
+            </w:pPr>
+            <w:r>
+              <w:rPr>
+                <w:rFonts w:ascii="Arial" w:hAnsi="Arial"/>
+                <w:sz w:val="18"/>
+              </w:rPr>
+              <w:t>Ajustar la figura</w:t>
+            </w:r>
+          </w:p>
+        </w:tc>
+        <w:tc>
+          <w:tcPr>
+            <w:tcW w:type="dxa" w:w="2340"/>
+            <w:tcMar>
+              <w:top w:w="80" w:type="dxa"/>
+              <w:bottom w:w="80" w:type="dxa"/>
+              <w:left w:w="100" w:type="dxa"/>
+              <w:right w:w="100" w:type="dxa"/>
+            </w:tcMar>
+            <w:shd w:fill="FAFAFA"/>
+          </w:tcPr>
+          <w:p>
+            <w:pPr>
+              <w:jc w:val="left"/>
+            </w:pPr>
+            <w:r>
+              <w:rPr>
+                <w:rFonts w:ascii="Arial" w:hAnsi="Arial"/>
+                <w:sz w:val="18"/>
+              </w:rPr>
+              <w:t>🖐️ SOLTAR (Release - RL)</w:t>
+            </w:r>
+          </w:p>
+        </w:tc>
+        <w:tc>
+          <w:tcPr>
+            <w:tcW w:type="dxa" w:w="2340"/>
+            <w:tcMar>
+              <w:top w:w="80" w:type="dxa"/>
+              <w:bottom w:w="80" w:type="dxa"/>
+              <w:left w:w="100" w:type="dxa"/>
+              <w:right w:w="100" w:type="dxa"/>
+            </w:tcMar>
+            <w:shd w:fill="FAFAFA"/>
+          </w:tcPr>
+          <w:p>
+            <w:pPr>
+              <w:jc w:val="left"/>
+            </w:pPr>
+            <w:r>
+              <w:rPr>
+                <w:rFonts w:ascii="Arial" w:hAnsi="Arial"/>
+                <w:sz w:val="18"/>
+              </w:rPr>
+              <w:t>Eficiente</w:t>
+            </w:r>
+          </w:p>
+        </w:tc>
+      </w:tr>
+    </w:tbl>
+    <w:p>
+      <w:pPr>
+        <w:spacing w:before="80" w:after="160"/>
+      </w:pPr>
+    </w:p>
+    <w:p>
+      <w:pPr>
+        <w:spacing w:before="0" w:after="120" w:line="276" w:lineRule="auto"/>
+        <w:jc w:val="both"/>
+      </w:pPr>
+      <w:r>
+        <w:rPr>
+          <w:rFonts w:ascii="Arial" w:hAnsi="Arial"/>
+          <w:b w:val="0"/>
+          <w:i/>
+          <w:sz w:val="22"/>
+        </w:rPr>
+        <w:t>Análisis de la Tabla 2.1: El desglose de los micromovimientos revela que la Grulla Básica se compone en un 79.5% de Therbligs eficientes (COGER y SOLTAR), lo cual es ideal desde la perspectiva del diseño del trabajo. No obstante, al inicio del ciclo (Paso 1: Posicion inicial) y en el Step 8 (Formar el cuello) se observan cuellos de botella temporales donde dominan los Therbligs ineficientes como Buscar (Sh) y Planear (Pl), retrasando la operación general.</w:t>
+      </w:r>
+    </w:p>
+    <w:p>
+      <w:pPr>
+        <w:spacing w:before="200" w:after="80" w:line="276" w:lineRule="auto"/>
+        <w:jc w:val="left"/>
+      </w:pPr>
+      <w:r>
+        <w:rPr>
+          <w:rFonts w:ascii="Arial" w:hAnsi="Arial"/>
+          <w:b/>
+          <w:i w:val="0"/>
+          <w:sz w:val="24"/>
+        </w:rPr>
+        <w:t>Gráfica de Micro-movimientos (SIMO) - Grulla Básica</w:t>
+      </w:r>
+    </w:p>
+    <w:p>
+      <w:pPr>
+        <w:jc w:val="center"/>
+      </w:pPr>
+      <w:r>
+        <w:drawing>
+          <wp:inline xmlns:a="http://schemas.openxmlformats.org/drawingml/2006/main" xmlns:pic="http://schemas.openxmlformats.org/drawingml/2006/picture">
+            <wp:extent cx="5303520" cy="2651760"/>
+            <wp:docPr id="2098001660" name="Picture 2098001660"/>
+            <wp:cNvGraphicFramePr>
+              <a:graphicFrameLocks noChangeAspect="1"/>
+            </wp:cNvGraphicFramePr>
+            <a:graphic>
+              <a:graphicData uri="http://schemas.openxmlformats.org/drawingml/2006/picture">
+                <pic:pic>
+                  <pic:nvPicPr>
+                    <pic:cNvPr id="0" name="simo_basic.png"/>
+                    <pic:cNvPicPr/>
+                  </pic:nvPicPr>
+                  <pic:blipFill>
+                    <a:blip r:embed="rId33"/>
+                    <a:stretch>
+                      <a:fillRect/>
+                    </a:stretch>
+                  </pic:blipFill>
+                  <pic:spPr>
+                    <a:xfrm>
+                      <a:off x="0" y="0"/>
+                      <a:ext cx="5303520" cy="2651760"/>
+                    </a:xfrm>
+                    <a:prstGeom prst="rect"/>
+                  </pic:spPr>
+                </pic:pic>
+              </a:graphicData>
+            </a:graphic>
+          </wp:inline>
+        </w:drawing>
+      </w:r>
+    </w:p>
+    <w:p>
+      <w:pPr>
+        <w:jc w:val="center"/>
+      </w:pPr>
+      <w:r>
+        <w:rPr>
+          <w:rFonts w:ascii="Arial" w:hAnsi="Arial"/>
+          <w:i/>
+          <w:sz w:val="19"/>
+        </w:rPr>
+        <w:t>Fig. 2.1. Carta SIMO apilada mostrando la relacion de Therbligs Eficientes vs Ineficientes para el proceso básico de 10 pasos.</w:t>
+      </w:r>
+    </w:p>
+    <w:p>
+      <w:pPr>
+        <w:spacing w:before="200" w:after="80" w:line="276" w:lineRule="auto"/>
+        <w:jc w:val="left"/>
+      </w:pPr>
+      <w:r>
+        <w:rPr>
+          <w:rFonts w:ascii="Arial" w:hAnsi="Arial"/>
+          <w:b/>
+          <w:i w:val="0"/>
+          <w:sz w:val="24"/>
+        </w:rPr>
+        <w:t>Explicacion y Diagnostico de la Gráfica SIMO (Grulla Básica)</w:t>
+      </w:r>
+    </w:p>
+    <w:p>
+      <w:pPr>
+        <w:spacing w:before="0" w:after="120" w:line="276" w:lineRule="auto"/>
+        <w:jc w:val="both"/>
+      </w:pPr>
+      <w:r>
+        <w:rPr>
+          <w:rFonts w:ascii="Arial" w:hAnsi="Arial"/>
+          <w:b w:val="0"/>
+          <w:i w:val="0"/>
+          <w:sz w:val="22"/>
+        </w:rPr>
+        <w:t>La Gráfica SIMO (Fig. 2.1) evidencia de manera cuantitativa que los pasos de mayor ineficiencia corresponden a la preparacion inicial (T1 con un 40% de tiempo ineficiente) y a la formacion del cuello (T8 con un 30%). En T1, el operario experimenta una carga mental de busqueda y seleccion de la hoja en el area de trabajo. En T8, la ineficiencia se debe al Therblig Planear (Pl), donde el operador debe decidir visualmente el ángulo exacto de doblado sin referencias físicas, lo que incrementa el tiempo de ciclo total y la variabilidad ergonómica.</w:t>
+      </w:r>
+    </w:p>
+    <w:p>
+      <w:pPr>
+        <w:spacing w:before="200" w:after="80" w:line="276" w:lineRule="auto"/>
+        <w:jc w:val="left"/>
+      </w:pPr>
+      <w:r>
+        <w:rPr>
+          <w:rFonts w:ascii="Arial" w:hAnsi="Arial"/>
+          <w:b/>
+          <w:i w:val="0"/>
+          <w:sz w:val="24"/>
+        </w:rPr>
+        <w:t>Propuestas de Mejora de Ingenieria para Eliminar Ineficiencias</w:t>
+      </w:r>
+    </w:p>
+    <w:p>
+      <w:pPr>
+        <w:spacing w:before="0" w:after="120" w:line="276" w:lineRule="auto"/>
+        <w:jc w:val="both"/>
+      </w:pPr>
+      <w:r>
+        <w:rPr>
+          <w:rFonts w:ascii="Arial" w:hAnsi="Arial"/>
+          <w:b w:val="0"/>
+          <w:i w:val="0"/>
+          <w:sz w:val="22"/>
+        </w:rPr>
+        <w:t>Para eliminar los Therbligs ineficientes (Desperdicio o Mudas) y optimizar la curva de aprendizaje, se proponen tres mejoras de diseño industrial:</w:t>
+        <w:br/>
+        <w:t xml:space="preserve">  1. Dispensador por Gravedad (Workstation Layout): Instalar un alimentador inclinado de hojas de papel en el area A del puesto de trabajo. Esto reduce a cero el Therblig de Buscar (Sh) y Seleccionar (Se) el papel, transformandolo directamente en un movimiento fluido de Coger (G).</w:t>
+        <w:br/>
+        <w:t xml:space="preserve">  2. Plantillas de Pre-marcado (Visual Jigs): Utilizar hojas de papel con marcas visuales de colores en los vertices. Esto elimina el Therblig cognitivo de Planear (Pl) en la tarea T8, guiando al ojo de forma instantánea al punto de pliegue.</w:t>
+        <w:br/>
+        <w:t xml:space="preserve">  3. Estandarizacion Bimanual (Coordinacion): Diseñar un patron de plegado donde la mano izquierda actue como soporte dinámico (Sostener coordinado) mientras la derecha ejecuta el pliegue, reduciendo la fatiga postural y muscular.</w:t>
+      </w:r>
+    </w:p>
+    <w:p>
+      <w:pPr>
         <w:spacing w:line="480" w:lineRule="auto"/>
         <w:jc w:val="center"/>
         <w:rPr>
@@ -3994,6 +5260,1464 @@
       </w:r>
       <w:r>
         <w:t xml:space="preserve"> y cola.</w:t>
+      </w:r>
+    </w:p>
+    <w:p>
+      <w:pPr>
+        <w:spacing w:before="240" w:after="80" w:line="276" w:lineRule="auto"/>
+        <w:jc w:val="left"/>
+      </w:pPr>
+      <w:r>
+        <w:rPr>
+          <w:rFonts w:ascii="Arial" w:hAnsi="Arial"/>
+          <w:b/>
+          <w:i w:val="0"/>
+          <w:sz w:val="24"/>
+        </w:rPr>
+        <w:t>2.2. Análisis de Micro-movimientos (Therbligs)</w:t>
+      </w:r>
+    </w:p>
+    <w:p>
+      <w:pPr>
+        <w:spacing w:before="0" w:after="120" w:line="276" w:lineRule="auto"/>
+        <w:jc w:val="both"/>
+      </w:pPr>
+      <w:r>
+        <w:rPr>
+          <w:rFonts w:ascii="Arial" w:hAnsi="Arial"/>
+          <w:b w:val="0"/>
+          <w:i w:val="0"/>
+          <w:sz w:val="22"/>
+        </w:rPr>
+        <w:t>En la variante intermedia de plegado de la grulla (que consta de 12 pasos y demanda una destreza motora fina considerablemente mayor), se aplico el mismo pipeline neuronal de CronoGrulla. La Tabla 2.2 expone la secuencia de Therbligs eficaces evaluados en tiempo real por el clasificador. Este análisis cuantitativo de micro-movimientos evidencia que la mayor parte del ciclo se compone de Therbligs eficientes de manipulación y plegado, requiriendo una coordinacion bimanual extrema y alta concentracion en los cuellos de botella del ensamble.</w:t>
+      </w:r>
+    </w:p>
+    <w:tbl>
+      <w:tblPr>
+        <w:tblW w:type="auto" w:w="0"/>
+        <w:jc w:val="center"/>
+        <w:tblLook w:firstColumn="1" w:firstRow="1" w:lastColumn="0" w:lastRow="0" w:noHBand="0" w:noVBand="1" w:val="04A0"/>
+        <w:tblBorders>
+          <w:top w:val="single" w:sz="12" w:space="0" w:color="555555"/>
+          <w:bottom w:val="single" w:sz="12" w:space="0" w:color="555555"/>
+          <w:insideH w:val="single" w:sz="4" w:space="0" w:color="AAAAAA"/>
+          <w:left w:val="none"/>
+          <w:right w:val="none"/>
+          <w:insideV w:val="none"/>
+        </w:tblBorders>
+      </w:tblPr>
+      <w:tblGrid>
+        <w:gridCol w:w="2340"/>
+        <w:gridCol w:w="2340"/>
+        <w:gridCol w:w="2340"/>
+        <w:gridCol w:w="2340"/>
+      </w:tblGrid>
+      <w:tr>
+        <w:tc>
+          <w:tcPr>
+            <w:tcW w:type="dxa" w:w="2340"/>
+            <w:shd w:fill="F2F4F7"/>
+            <w:tcMar>
+              <w:top w:w="80" w:type="dxa"/>
+              <w:bottom w:w="80" w:type="dxa"/>
+              <w:left w:w="100" w:type="dxa"/>
+              <w:right w:w="100" w:type="dxa"/>
+            </w:tcMar>
+          </w:tcPr>
+          <w:p>
+            <w:pPr>
+              <w:jc w:val="center"/>
+            </w:pPr>
+            <w:r>
+              <w:rPr>
+                <w:rFonts w:ascii="Arial" w:hAnsi="Arial"/>
+                <w:b/>
+                <w:sz w:val="19"/>
+              </w:rPr>
+              <w:t>Paso / Elemento</w:t>
+            </w:r>
+          </w:p>
+        </w:tc>
+        <w:tc>
+          <w:tcPr>
+            <w:tcW w:type="dxa" w:w="2340"/>
+            <w:shd w:fill="F2F4F7"/>
+            <w:tcMar>
+              <w:top w:w="80" w:type="dxa"/>
+              <w:bottom w:w="80" w:type="dxa"/>
+              <w:left w:w="100" w:type="dxa"/>
+              <w:right w:w="100" w:type="dxa"/>
+            </w:tcMar>
+          </w:tcPr>
+          <w:p>
+            <w:pPr>
+              <w:jc w:val="center"/>
+            </w:pPr>
+            <w:r>
+              <w:rPr>
+                <w:rFonts w:ascii="Arial" w:hAnsi="Arial"/>
+                <w:b/>
+                <w:sz w:val="19"/>
+              </w:rPr>
+              <w:t>Actividad del Metodo</w:t>
+            </w:r>
+          </w:p>
+        </w:tc>
+        <w:tc>
+          <w:tcPr>
+            <w:tcW w:type="dxa" w:w="2340"/>
+            <w:shd w:fill="F2F4F7"/>
+            <w:tcMar>
+              <w:top w:w="80" w:type="dxa"/>
+              <w:bottom w:w="80" w:type="dxa"/>
+              <w:left w:w="100" w:type="dxa"/>
+              <w:right w:w="100" w:type="dxa"/>
+            </w:tcMar>
+          </w:tcPr>
+          <w:p>
+            <w:pPr>
+              <w:jc w:val="center"/>
+            </w:pPr>
+            <w:r>
+              <w:rPr>
+                <w:rFonts w:ascii="Arial" w:hAnsi="Arial"/>
+                <w:b/>
+                <w:sz w:val="19"/>
+              </w:rPr>
+              <w:t>Therblig Predominante</w:t>
+            </w:r>
+          </w:p>
+        </w:tc>
+        <w:tc>
+          <w:tcPr>
+            <w:tcW w:type="dxa" w:w="2340"/>
+            <w:shd w:fill="F2F4F7"/>
+            <w:tcMar>
+              <w:top w:w="80" w:type="dxa"/>
+              <w:bottom w:w="80" w:type="dxa"/>
+              <w:left w:w="100" w:type="dxa"/>
+              <w:right w:w="100" w:type="dxa"/>
+            </w:tcMar>
+          </w:tcPr>
+          <w:p>
+            <w:pPr>
+              <w:jc w:val="center"/>
+            </w:pPr>
+            <w:r>
+              <w:rPr>
+                <w:rFonts w:ascii="Arial" w:hAnsi="Arial"/>
+                <w:b/>
+                <w:sz w:val="19"/>
+              </w:rPr>
+              <w:t>Tipo de Therblig</w:t>
+            </w:r>
+          </w:p>
+        </w:tc>
+      </w:tr>
+      <w:tr>
+        <w:tc>
+          <w:tcPr>
+            <w:tcW w:type="dxa" w:w="2340"/>
+            <w:tcMar>
+              <w:top w:w="80" w:type="dxa"/>
+              <w:bottom w:w="80" w:type="dxa"/>
+              <w:left w:w="100" w:type="dxa"/>
+              <w:right w:w="100" w:type="dxa"/>
+            </w:tcMar>
+          </w:tcPr>
+          <w:p>
+            <w:pPr>
+              <w:jc w:val="center"/>
+            </w:pPr>
+            <w:r>
+              <w:rPr>
+                <w:rFonts w:ascii="Arial" w:hAnsi="Arial"/>
+                <w:sz w:val="18"/>
+              </w:rPr>
+              <w:t>Paso 1</w:t>
+            </w:r>
+          </w:p>
+        </w:tc>
+        <w:tc>
+          <w:tcPr>
+            <w:tcW w:type="dxa" w:w="2340"/>
+            <w:tcMar>
+              <w:top w:w="80" w:type="dxa"/>
+              <w:bottom w:w="80" w:type="dxa"/>
+              <w:left w:w="100" w:type="dxa"/>
+              <w:right w:w="100" w:type="dxa"/>
+            </w:tcMar>
+          </w:tcPr>
+          <w:p>
+            <w:pPr>
+              <w:jc w:val="left"/>
+            </w:pPr>
+            <w:r>
+              <w:rPr>
+                <w:rFonts w:ascii="Arial" w:hAnsi="Arial"/>
+                <w:sz w:val="18"/>
+              </w:rPr>
+              <w:t>Diagonal y mitad</w:t>
+            </w:r>
+          </w:p>
+        </w:tc>
+        <w:tc>
+          <w:tcPr>
+            <w:tcW w:type="dxa" w:w="2340"/>
+            <w:tcMar>
+              <w:top w:w="80" w:type="dxa"/>
+              <w:bottom w:w="80" w:type="dxa"/>
+              <w:left w:w="100" w:type="dxa"/>
+              <w:right w:w="100" w:type="dxa"/>
+            </w:tcMar>
+          </w:tcPr>
+          <w:p>
+            <w:pPr>
+              <w:jc w:val="left"/>
+            </w:pPr>
+            <w:r>
+              <w:rPr>
+                <w:rFonts w:ascii="Arial" w:hAnsi="Arial"/>
+                <w:sz w:val="18"/>
+              </w:rPr>
+              <w:t>✊ COGER (Grasp - G)</w:t>
+            </w:r>
+          </w:p>
+        </w:tc>
+        <w:tc>
+          <w:tcPr>
+            <w:tcW w:type="dxa" w:w="2340"/>
+            <w:tcMar>
+              <w:top w:w="80" w:type="dxa"/>
+              <w:bottom w:w="80" w:type="dxa"/>
+              <w:left w:w="100" w:type="dxa"/>
+              <w:right w:w="100" w:type="dxa"/>
+            </w:tcMar>
+          </w:tcPr>
+          <w:p>
+            <w:pPr>
+              <w:jc w:val="left"/>
+            </w:pPr>
+            <w:r>
+              <w:rPr>
+                <w:rFonts w:ascii="Arial" w:hAnsi="Arial"/>
+                <w:sz w:val="18"/>
+              </w:rPr>
+              <w:t>Eficiente</w:t>
+            </w:r>
+          </w:p>
+        </w:tc>
+      </w:tr>
+      <w:tr>
+        <w:tc>
+          <w:tcPr>
+            <w:tcW w:type="dxa" w:w="2340"/>
+            <w:tcMar>
+              <w:top w:w="80" w:type="dxa"/>
+              <w:bottom w:w="80" w:type="dxa"/>
+              <w:left w:w="100" w:type="dxa"/>
+              <w:right w:w="100" w:type="dxa"/>
+            </w:tcMar>
+            <w:shd w:fill="FAFAFA"/>
+          </w:tcPr>
+          <w:p>
+            <w:pPr>
+              <w:jc w:val="center"/>
+            </w:pPr>
+            <w:r>
+              <w:rPr>
+                <w:rFonts w:ascii="Arial" w:hAnsi="Arial"/>
+                <w:sz w:val="18"/>
+              </w:rPr>
+              <w:t>Paso 2</w:t>
+            </w:r>
+          </w:p>
+        </w:tc>
+        <w:tc>
+          <w:tcPr>
+            <w:tcW w:type="dxa" w:w="2340"/>
+            <w:tcMar>
+              <w:top w:w="80" w:type="dxa"/>
+              <w:bottom w:w="80" w:type="dxa"/>
+              <w:left w:w="100" w:type="dxa"/>
+              <w:right w:w="100" w:type="dxa"/>
+            </w:tcMar>
+            <w:shd w:fill="FAFAFA"/>
+          </w:tcPr>
+          <w:p>
+            <w:pPr>
+              <w:jc w:val="left"/>
+            </w:pPr>
+            <w:r>
+              <w:rPr>
+                <w:rFonts w:ascii="Arial" w:hAnsi="Arial"/>
+                <w:sz w:val="18"/>
+              </w:rPr>
+              <w:t>Pliegues cruzados</w:t>
+            </w:r>
+          </w:p>
+        </w:tc>
+        <w:tc>
+          <w:tcPr>
+            <w:tcW w:type="dxa" w:w="2340"/>
+            <w:tcMar>
+              <w:top w:w="80" w:type="dxa"/>
+              <w:bottom w:w="80" w:type="dxa"/>
+              <w:left w:w="100" w:type="dxa"/>
+              <w:right w:w="100" w:type="dxa"/>
+            </w:tcMar>
+            <w:shd w:fill="FAFAFA"/>
+          </w:tcPr>
+          <w:p>
+            <w:pPr>
+              <w:jc w:val="left"/>
+            </w:pPr>
+            <w:r>
+              <w:rPr>
+                <w:rFonts w:ascii="Arial" w:hAnsi="Arial"/>
+                <w:sz w:val="18"/>
+              </w:rPr>
+              <w:t>✊ COGER (Grasp - G)</w:t>
+            </w:r>
+          </w:p>
+        </w:tc>
+        <w:tc>
+          <w:tcPr>
+            <w:tcW w:type="dxa" w:w="2340"/>
+            <w:tcMar>
+              <w:top w:w="80" w:type="dxa"/>
+              <w:bottom w:w="80" w:type="dxa"/>
+              <w:left w:w="100" w:type="dxa"/>
+              <w:right w:w="100" w:type="dxa"/>
+            </w:tcMar>
+            <w:shd w:fill="FAFAFA"/>
+          </w:tcPr>
+          <w:p>
+            <w:pPr>
+              <w:jc w:val="left"/>
+            </w:pPr>
+            <w:r>
+              <w:rPr>
+                <w:rFonts w:ascii="Arial" w:hAnsi="Arial"/>
+                <w:sz w:val="18"/>
+              </w:rPr>
+              <w:t>Eficiente</w:t>
+            </w:r>
+          </w:p>
+        </w:tc>
+      </w:tr>
+      <w:tr>
+        <w:tc>
+          <w:tcPr>
+            <w:tcW w:type="dxa" w:w="2340"/>
+            <w:tcMar>
+              <w:top w:w="80" w:type="dxa"/>
+              <w:bottom w:w="80" w:type="dxa"/>
+              <w:left w:w="100" w:type="dxa"/>
+              <w:right w:w="100" w:type="dxa"/>
+            </w:tcMar>
+          </w:tcPr>
+          <w:p>
+            <w:pPr>
+              <w:jc w:val="center"/>
+            </w:pPr>
+            <w:r>
+              <w:rPr>
+                <w:rFonts w:ascii="Arial" w:hAnsi="Arial"/>
+                <w:sz w:val="18"/>
+              </w:rPr>
+              <w:t>Paso 3</w:t>
+            </w:r>
+          </w:p>
+        </w:tc>
+        <w:tc>
+          <w:tcPr>
+            <w:tcW w:type="dxa" w:w="2340"/>
+            <w:tcMar>
+              <w:top w:w="80" w:type="dxa"/>
+              <w:bottom w:w="80" w:type="dxa"/>
+              <w:left w:w="100" w:type="dxa"/>
+              <w:right w:w="100" w:type="dxa"/>
+            </w:tcMar>
+          </w:tcPr>
+          <w:p>
+            <w:pPr>
+              <w:jc w:val="left"/>
+            </w:pPr>
+            <w:r>
+              <w:rPr>
+                <w:rFonts w:ascii="Arial" w:hAnsi="Arial"/>
+                <w:sz w:val="18"/>
+              </w:rPr>
+              <w:t>Juntar esquinas (Base)</w:t>
+            </w:r>
+          </w:p>
+        </w:tc>
+        <w:tc>
+          <w:tcPr>
+            <w:tcW w:type="dxa" w:w="2340"/>
+            <w:tcMar>
+              <w:top w:w="80" w:type="dxa"/>
+              <w:bottom w:w="80" w:type="dxa"/>
+              <w:left w:w="100" w:type="dxa"/>
+              <w:right w:w="100" w:type="dxa"/>
+            </w:tcMar>
+          </w:tcPr>
+          <w:p>
+            <w:pPr>
+              <w:jc w:val="left"/>
+            </w:pPr>
+            <w:r>
+              <w:rPr>
+                <w:rFonts w:ascii="Arial" w:hAnsi="Arial"/>
+                <w:sz w:val="18"/>
+              </w:rPr>
+              <w:t>✊ COGER (Grasp - G)</w:t>
+            </w:r>
+          </w:p>
+        </w:tc>
+        <w:tc>
+          <w:tcPr>
+            <w:tcW w:type="dxa" w:w="2340"/>
+            <w:tcMar>
+              <w:top w:w="80" w:type="dxa"/>
+              <w:bottom w:w="80" w:type="dxa"/>
+              <w:left w:w="100" w:type="dxa"/>
+              <w:right w:w="100" w:type="dxa"/>
+            </w:tcMar>
+          </w:tcPr>
+          <w:p>
+            <w:pPr>
+              <w:jc w:val="left"/>
+            </w:pPr>
+            <w:r>
+              <w:rPr>
+                <w:rFonts w:ascii="Arial" w:hAnsi="Arial"/>
+                <w:sz w:val="18"/>
+              </w:rPr>
+              <w:t>Eficiente</w:t>
+            </w:r>
+          </w:p>
+        </w:tc>
+      </w:tr>
+      <w:tr>
+        <w:tc>
+          <w:tcPr>
+            <w:tcW w:type="dxa" w:w="2340"/>
+            <w:tcMar>
+              <w:top w:w="80" w:type="dxa"/>
+              <w:bottom w:w="80" w:type="dxa"/>
+              <w:left w:w="100" w:type="dxa"/>
+              <w:right w:w="100" w:type="dxa"/>
+            </w:tcMar>
+            <w:shd w:fill="FAFAFA"/>
+          </w:tcPr>
+          <w:p>
+            <w:pPr>
+              <w:jc w:val="center"/>
+            </w:pPr>
+            <w:r>
+              <w:rPr>
+                <w:rFonts w:ascii="Arial" w:hAnsi="Arial"/>
+                <w:sz w:val="18"/>
+              </w:rPr>
+              <w:t>Paso 4</w:t>
+            </w:r>
+          </w:p>
+        </w:tc>
+        <w:tc>
+          <w:tcPr>
+            <w:tcW w:type="dxa" w:w="2340"/>
+            <w:tcMar>
+              <w:top w:w="80" w:type="dxa"/>
+              <w:bottom w:w="80" w:type="dxa"/>
+              <w:left w:w="100" w:type="dxa"/>
+              <w:right w:w="100" w:type="dxa"/>
+            </w:tcMar>
+            <w:shd w:fill="FAFAFA"/>
+          </w:tcPr>
+          <w:p>
+            <w:pPr>
+              <w:jc w:val="left"/>
+            </w:pPr>
+            <w:r>
+              <w:rPr>
+                <w:rFonts w:ascii="Arial" w:hAnsi="Arial"/>
+                <w:sz w:val="18"/>
+              </w:rPr>
+              <w:t>Marcar solapas</w:t>
+            </w:r>
+          </w:p>
+        </w:tc>
+        <w:tc>
+          <w:tcPr>
+            <w:tcW w:type="dxa" w:w="2340"/>
+            <w:tcMar>
+              <w:top w:w="80" w:type="dxa"/>
+              <w:bottom w:w="80" w:type="dxa"/>
+              <w:left w:w="100" w:type="dxa"/>
+              <w:right w:w="100" w:type="dxa"/>
+            </w:tcMar>
+            <w:shd w:fill="FAFAFA"/>
+          </w:tcPr>
+          <w:p>
+            <w:pPr>
+              <w:jc w:val="left"/>
+            </w:pPr>
+            <w:r>
+              <w:rPr>
+                <w:rFonts w:ascii="Arial" w:hAnsi="Arial"/>
+                <w:sz w:val="18"/>
+              </w:rPr>
+              <w:t>✊ COGER (Grasp - G)</w:t>
+            </w:r>
+          </w:p>
+        </w:tc>
+        <w:tc>
+          <w:tcPr>
+            <w:tcW w:type="dxa" w:w="2340"/>
+            <w:tcMar>
+              <w:top w:w="80" w:type="dxa"/>
+              <w:bottom w:w="80" w:type="dxa"/>
+              <w:left w:w="100" w:type="dxa"/>
+              <w:right w:w="100" w:type="dxa"/>
+            </w:tcMar>
+            <w:shd w:fill="FAFAFA"/>
+          </w:tcPr>
+          <w:p>
+            <w:pPr>
+              <w:jc w:val="left"/>
+            </w:pPr>
+            <w:r>
+              <w:rPr>
+                <w:rFonts w:ascii="Arial" w:hAnsi="Arial"/>
+                <w:sz w:val="18"/>
+              </w:rPr>
+              <w:t>Eficiente</w:t>
+            </w:r>
+          </w:p>
+        </w:tc>
+      </w:tr>
+      <w:tr>
+        <w:tc>
+          <w:tcPr>
+            <w:tcW w:type="dxa" w:w="2340"/>
+            <w:tcMar>
+              <w:top w:w="80" w:type="dxa"/>
+              <w:bottom w:w="80" w:type="dxa"/>
+              <w:left w:w="100" w:type="dxa"/>
+              <w:right w:w="100" w:type="dxa"/>
+            </w:tcMar>
+          </w:tcPr>
+          <w:p>
+            <w:pPr>
+              <w:jc w:val="center"/>
+            </w:pPr>
+            <w:r>
+              <w:rPr>
+                <w:rFonts w:ascii="Arial" w:hAnsi="Arial"/>
+                <w:sz w:val="18"/>
+              </w:rPr>
+              <w:t>Paso 5</w:t>
+            </w:r>
+          </w:p>
+        </w:tc>
+        <w:tc>
+          <w:tcPr>
+            <w:tcW w:type="dxa" w:w="2340"/>
+            <w:tcMar>
+              <w:top w:w="80" w:type="dxa"/>
+              <w:bottom w:w="80" w:type="dxa"/>
+              <w:left w:w="100" w:type="dxa"/>
+              <w:right w:w="100" w:type="dxa"/>
+            </w:tcMar>
+          </w:tcPr>
+          <w:p>
+            <w:pPr>
+              <w:jc w:val="left"/>
+            </w:pPr>
+            <w:r>
+              <w:rPr>
+                <w:rFonts w:ascii="Arial" w:hAnsi="Arial"/>
+                <w:sz w:val="18"/>
+              </w:rPr>
+              <w:t>Marcar punta superior</w:t>
+            </w:r>
+          </w:p>
+        </w:tc>
+        <w:tc>
+          <w:tcPr>
+            <w:tcW w:type="dxa" w:w="2340"/>
+            <w:tcMar>
+              <w:top w:w="80" w:type="dxa"/>
+              <w:bottom w:w="80" w:type="dxa"/>
+              <w:left w:w="100" w:type="dxa"/>
+              <w:right w:w="100" w:type="dxa"/>
+            </w:tcMar>
+          </w:tcPr>
+          <w:p>
+            <w:pPr>
+              <w:jc w:val="left"/>
+            </w:pPr>
+            <w:r>
+              <w:rPr>
+                <w:rFonts w:ascii="Arial" w:hAnsi="Arial"/>
+                <w:sz w:val="18"/>
+              </w:rPr>
+              <w:t>✊ COGER (Grasp - G)</w:t>
+            </w:r>
+          </w:p>
+        </w:tc>
+        <w:tc>
+          <w:tcPr>
+            <w:tcW w:type="dxa" w:w="2340"/>
+            <w:tcMar>
+              <w:top w:w="80" w:type="dxa"/>
+              <w:bottom w:w="80" w:type="dxa"/>
+              <w:left w:w="100" w:type="dxa"/>
+              <w:right w:w="100" w:type="dxa"/>
+            </w:tcMar>
+          </w:tcPr>
+          <w:p>
+            <w:pPr>
+              <w:jc w:val="left"/>
+            </w:pPr>
+            <w:r>
+              <w:rPr>
+                <w:rFonts w:ascii="Arial" w:hAnsi="Arial"/>
+                <w:sz w:val="18"/>
+              </w:rPr>
+              <w:t>Eficiente</w:t>
+            </w:r>
+          </w:p>
+        </w:tc>
+      </w:tr>
+      <w:tr>
+        <w:tc>
+          <w:tcPr>
+            <w:tcW w:type="dxa" w:w="2340"/>
+            <w:tcMar>
+              <w:top w:w="80" w:type="dxa"/>
+              <w:bottom w:w="80" w:type="dxa"/>
+              <w:left w:w="100" w:type="dxa"/>
+              <w:right w:w="100" w:type="dxa"/>
+            </w:tcMar>
+            <w:shd w:fill="FAFAFA"/>
+          </w:tcPr>
+          <w:p>
+            <w:pPr>
+              <w:jc w:val="center"/>
+            </w:pPr>
+            <w:r>
+              <w:rPr>
+                <w:rFonts w:ascii="Arial" w:hAnsi="Arial"/>
+                <w:sz w:val="18"/>
+              </w:rPr>
+              <w:t>Paso 6</w:t>
+            </w:r>
+          </w:p>
+        </w:tc>
+        <w:tc>
+          <w:tcPr>
+            <w:tcW w:type="dxa" w:w="2340"/>
+            <w:tcMar>
+              <w:top w:w="80" w:type="dxa"/>
+              <w:bottom w:w="80" w:type="dxa"/>
+              <w:left w:w="100" w:type="dxa"/>
+              <w:right w:w="100" w:type="dxa"/>
+            </w:tcMar>
+            <w:shd w:fill="FAFAFA"/>
+          </w:tcPr>
+          <w:p>
+            <w:pPr>
+              <w:jc w:val="left"/>
+            </w:pPr>
+            <w:r>
+              <w:rPr>
+                <w:rFonts w:ascii="Arial" w:hAnsi="Arial"/>
+                <w:sz w:val="18"/>
+              </w:rPr>
+              <w:t>Abrir solapa superior</w:t>
+            </w:r>
+          </w:p>
+        </w:tc>
+        <w:tc>
+          <w:tcPr>
+            <w:tcW w:type="dxa" w:w="2340"/>
+            <w:tcMar>
+              <w:top w:w="80" w:type="dxa"/>
+              <w:bottom w:w="80" w:type="dxa"/>
+              <w:left w:w="100" w:type="dxa"/>
+              <w:right w:w="100" w:type="dxa"/>
+            </w:tcMar>
+            <w:shd w:fill="FAFAFA"/>
+          </w:tcPr>
+          <w:p>
+            <w:pPr>
+              <w:jc w:val="left"/>
+            </w:pPr>
+            <w:r>
+              <w:rPr>
+                <w:rFonts w:ascii="Arial" w:hAnsi="Arial"/>
+                <w:sz w:val="18"/>
+              </w:rPr>
+              <w:t>🖐️ SOLTAR (Release - RL)</w:t>
+            </w:r>
+          </w:p>
+        </w:tc>
+        <w:tc>
+          <w:tcPr>
+            <w:tcW w:type="dxa" w:w="2340"/>
+            <w:tcMar>
+              <w:top w:w="80" w:type="dxa"/>
+              <w:bottom w:w="80" w:type="dxa"/>
+              <w:left w:w="100" w:type="dxa"/>
+              <w:right w:w="100" w:type="dxa"/>
+            </w:tcMar>
+            <w:shd w:fill="FAFAFA"/>
+          </w:tcPr>
+          <w:p>
+            <w:pPr>
+              <w:jc w:val="left"/>
+            </w:pPr>
+            <w:r>
+              <w:rPr>
+                <w:rFonts w:ascii="Arial" w:hAnsi="Arial"/>
+                <w:sz w:val="18"/>
+              </w:rPr>
+              <w:t>Eficiente</w:t>
+            </w:r>
+          </w:p>
+        </w:tc>
+      </w:tr>
+      <w:tr>
+        <w:tc>
+          <w:tcPr>
+            <w:tcW w:type="dxa" w:w="2340"/>
+            <w:tcMar>
+              <w:top w:w="80" w:type="dxa"/>
+              <w:bottom w:w="80" w:type="dxa"/>
+              <w:left w:w="100" w:type="dxa"/>
+              <w:right w:w="100" w:type="dxa"/>
+            </w:tcMar>
+          </w:tcPr>
+          <w:p>
+            <w:pPr>
+              <w:jc w:val="center"/>
+            </w:pPr>
+            <w:r>
+              <w:rPr>
+                <w:rFonts w:ascii="Arial" w:hAnsi="Arial"/>
+                <w:sz w:val="18"/>
+              </w:rPr>
+              <w:t>Paso 7</w:t>
+            </w:r>
+          </w:p>
+        </w:tc>
+        <w:tc>
+          <w:tcPr>
+            <w:tcW w:type="dxa" w:w="2340"/>
+            <w:tcMar>
+              <w:top w:w="80" w:type="dxa"/>
+              <w:bottom w:w="80" w:type="dxa"/>
+              <w:left w:w="100" w:type="dxa"/>
+              <w:right w:w="100" w:type="dxa"/>
+            </w:tcMar>
+          </w:tcPr>
+          <w:p>
+            <w:pPr>
+              <w:jc w:val="left"/>
+            </w:pPr>
+            <w:r>
+              <w:rPr>
+                <w:rFonts w:ascii="Arial" w:hAnsi="Arial"/>
+                <w:sz w:val="18"/>
+              </w:rPr>
+              <w:t>Repetir cara posterior</w:t>
+            </w:r>
+          </w:p>
+        </w:tc>
+        <w:tc>
+          <w:tcPr>
+            <w:tcW w:type="dxa" w:w="2340"/>
+            <w:tcMar>
+              <w:top w:w="80" w:type="dxa"/>
+              <w:bottom w:w="80" w:type="dxa"/>
+              <w:left w:w="100" w:type="dxa"/>
+              <w:right w:w="100" w:type="dxa"/>
+            </w:tcMar>
+          </w:tcPr>
+          <w:p>
+            <w:pPr>
+              <w:jc w:val="left"/>
+            </w:pPr>
+            <w:r>
+              <w:rPr>
+                <w:rFonts w:ascii="Arial" w:hAnsi="Arial"/>
+                <w:sz w:val="18"/>
+              </w:rPr>
+              <w:t>✊ COGER (Grasp - G)</w:t>
+            </w:r>
+          </w:p>
+        </w:tc>
+        <w:tc>
+          <w:tcPr>
+            <w:tcW w:type="dxa" w:w="2340"/>
+            <w:tcMar>
+              <w:top w:w="80" w:type="dxa"/>
+              <w:bottom w:w="80" w:type="dxa"/>
+              <w:left w:w="100" w:type="dxa"/>
+              <w:right w:w="100" w:type="dxa"/>
+            </w:tcMar>
+          </w:tcPr>
+          <w:p>
+            <w:pPr>
+              <w:jc w:val="left"/>
+            </w:pPr>
+            <w:r>
+              <w:rPr>
+                <w:rFonts w:ascii="Arial" w:hAnsi="Arial"/>
+                <w:sz w:val="18"/>
+              </w:rPr>
+              <w:t>Eficiente</w:t>
+            </w:r>
+          </w:p>
+        </w:tc>
+      </w:tr>
+      <w:tr>
+        <w:tc>
+          <w:tcPr>
+            <w:tcW w:type="dxa" w:w="2340"/>
+            <w:tcMar>
+              <w:top w:w="80" w:type="dxa"/>
+              <w:bottom w:w="80" w:type="dxa"/>
+              <w:left w:w="100" w:type="dxa"/>
+              <w:right w:w="100" w:type="dxa"/>
+            </w:tcMar>
+            <w:shd w:fill="FAFAFA"/>
+          </w:tcPr>
+          <w:p>
+            <w:pPr>
+              <w:jc w:val="center"/>
+            </w:pPr>
+            <w:r>
+              <w:rPr>
+                <w:rFonts w:ascii="Arial" w:hAnsi="Arial"/>
+                <w:sz w:val="18"/>
+              </w:rPr>
+              <w:t>Paso 8</w:t>
+            </w:r>
+          </w:p>
+        </w:tc>
+        <w:tc>
+          <w:tcPr>
+            <w:tcW w:type="dxa" w:w="2340"/>
+            <w:tcMar>
+              <w:top w:w="80" w:type="dxa"/>
+              <w:bottom w:w="80" w:type="dxa"/>
+              <w:left w:w="100" w:type="dxa"/>
+              <w:right w:w="100" w:type="dxa"/>
+            </w:tcMar>
+            <w:shd w:fill="FAFAFA"/>
+          </w:tcPr>
+          <w:p>
+            <w:pPr>
+              <w:jc w:val="left"/>
+            </w:pPr>
+            <w:r>
+              <w:rPr>
+                <w:rFonts w:ascii="Arial" w:hAnsi="Arial"/>
+                <w:sz w:val="18"/>
+              </w:rPr>
+              <w:t>Solapas al centro</w:t>
+            </w:r>
+          </w:p>
+        </w:tc>
+        <w:tc>
+          <w:tcPr>
+            <w:tcW w:type="dxa" w:w="2340"/>
+            <w:tcMar>
+              <w:top w:w="80" w:type="dxa"/>
+              <w:bottom w:w="80" w:type="dxa"/>
+              <w:left w:w="100" w:type="dxa"/>
+              <w:right w:w="100" w:type="dxa"/>
+            </w:tcMar>
+            <w:shd w:fill="FAFAFA"/>
+          </w:tcPr>
+          <w:p>
+            <w:pPr>
+              <w:jc w:val="left"/>
+            </w:pPr>
+            <w:r>
+              <w:rPr>
+                <w:rFonts w:ascii="Arial" w:hAnsi="Arial"/>
+                <w:sz w:val="18"/>
+              </w:rPr>
+              <w:t>✊ COGER (Grasp - G)</w:t>
+            </w:r>
+          </w:p>
+        </w:tc>
+        <w:tc>
+          <w:tcPr>
+            <w:tcW w:type="dxa" w:w="2340"/>
+            <w:tcMar>
+              <w:top w:w="80" w:type="dxa"/>
+              <w:bottom w:w="80" w:type="dxa"/>
+              <w:left w:w="100" w:type="dxa"/>
+              <w:right w:w="100" w:type="dxa"/>
+            </w:tcMar>
+            <w:shd w:fill="FAFAFA"/>
+          </w:tcPr>
+          <w:p>
+            <w:pPr>
+              <w:jc w:val="left"/>
+            </w:pPr>
+            <w:r>
+              <w:rPr>
+                <w:rFonts w:ascii="Arial" w:hAnsi="Arial"/>
+                <w:sz w:val="18"/>
+              </w:rPr>
+              <w:t>Eficiente</w:t>
+            </w:r>
+          </w:p>
+        </w:tc>
+      </w:tr>
+      <w:tr>
+        <w:tc>
+          <w:tcPr>
+            <w:tcW w:type="dxa" w:w="2340"/>
+            <w:tcMar>
+              <w:top w:w="80" w:type="dxa"/>
+              <w:bottom w:w="80" w:type="dxa"/>
+              <w:left w:w="100" w:type="dxa"/>
+              <w:right w:w="100" w:type="dxa"/>
+            </w:tcMar>
+          </w:tcPr>
+          <w:p>
+            <w:pPr>
+              <w:jc w:val="center"/>
+            </w:pPr>
+            <w:r>
+              <w:rPr>
+                <w:rFonts w:ascii="Arial" w:hAnsi="Arial"/>
+                <w:sz w:val="18"/>
+              </w:rPr>
+              <w:t>Paso 9</w:t>
+            </w:r>
+          </w:p>
+        </w:tc>
+        <w:tc>
+          <w:tcPr>
+            <w:tcW w:type="dxa" w:w="2340"/>
+            <w:tcMar>
+              <w:top w:w="80" w:type="dxa"/>
+              <w:bottom w:w="80" w:type="dxa"/>
+              <w:left w:w="100" w:type="dxa"/>
+              <w:right w:w="100" w:type="dxa"/>
+            </w:tcMar>
+          </w:tcPr>
+          <w:p>
+            <w:pPr>
+              <w:jc w:val="left"/>
+            </w:pPr>
+            <w:r>
+              <w:rPr>
+                <w:rFonts w:ascii="Arial" w:hAnsi="Arial"/>
+                <w:sz w:val="18"/>
+              </w:rPr>
+              <w:t>Repetir lado opuesto</w:t>
+            </w:r>
+          </w:p>
+        </w:tc>
+        <w:tc>
+          <w:tcPr>
+            <w:tcW w:type="dxa" w:w="2340"/>
+            <w:tcMar>
+              <w:top w:w="80" w:type="dxa"/>
+              <w:bottom w:w="80" w:type="dxa"/>
+              <w:left w:w="100" w:type="dxa"/>
+              <w:right w:w="100" w:type="dxa"/>
+            </w:tcMar>
+          </w:tcPr>
+          <w:p>
+            <w:pPr>
+              <w:jc w:val="left"/>
+            </w:pPr>
+            <w:r>
+              <w:rPr>
+                <w:rFonts w:ascii="Arial" w:hAnsi="Arial"/>
+                <w:sz w:val="18"/>
+              </w:rPr>
+              <w:t>✊ COGER (Grasp - G)</w:t>
+            </w:r>
+          </w:p>
+        </w:tc>
+        <w:tc>
+          <w:tcPr>
+            <w:tcW w:type="dxa" w:w="2340"/>
+            <w:tcMar>
+              <w:top w:w="80" w:type="dxa"/>
+              <w:bottom w:w="80" w:type="dxa"/>
+              <w:left w:w="100" w:type="dxa"/>
+              <w:right w:w="100" w:type="dxa"/>
+            </w:tcMar>
+          </w:tcPr>
+          <w:p>
+            <w:pPr>
+              <w:jc w:val="left"/>
+            </w:pPr>
+            <w:r>
+              <w:rPr>
+                <w:rFonts w:ascii="Arial" w:hAnsi="Arial"/>
+                <w:sz w:val="18"/>
+              </w:rPr>
+              <w:t>Eficiente</w:t>
+            </w:r>
+          </w:p>
+        </w:tc>
+      </w:tr>
+      <w:tr>
+        <w:tc>
+          <w:tcPr>
+            <w:tcW w:type="dxa" w:w="2340"/>
+            <w:tcMar>
+              <w:top w:w="80" w:type="dxa"/>
+              <w:bottom w:w="80" w:type="dxa"/>
+              <w:left w:w="100" w:type="dxa"/>
+              <w:right w:w="100" w:type="dxa"/>
+            </w:tcMar>
+            <w:shd w:fill="FAFAFA"/>
+          </w:tcPr>
+          <w:p>
+            <w:pPr>
+              <w:jc w:val="center"/>
+            </w:pPr>
+            <w:r>
+              <w:rPr>
+                <w:rFonts w:ascii="Arial" w:hAnsi="Arial"/>
+                <w:sz w:val="18"/>
+              </w:rPr>
+              <w:t>Paso 10</w:t>
+            </w:r>
+          </w:p>
+        </w:tc>
+        <w:tc>
+          <w:tcPr>
+            <w:tcW w:type="dxa" w:w="2340"/>
+            <w:tcMar>
+              <w:top w:w="80" w:type="dxa"/>
+              <w:bottom w:w="80" w:type="dxa"/>
+              <w:left w:w="100" w:type="dxa"/>
+              <w:right w:w="100" w:type="dxa"/>
+            </w:tcMar>
+            <w:shd w:fill="FAFAFA"/>
+          </w:tcPr>
+          <w:p>
+            <w:pPr>
+              <w:jc w:val="left"/>
+            </w:pPr>
+            <w:r>
+              <w:rPr>
+                <w:rFonts w:ascii="Arial" w:hAnsi="Arial"/>
+                <w:sz w:val="18"/>
+              </w:rPr>
+              <w:t>Marcar patas inf.</w:t>
+            </w:r>
+          </w:p>
+        </w:tc>
+        <w:tc>
+          <w:tcPr>
+            <w:tcW w:type="dxa" w:w="2340"/>
+            <w:tcMar>
+              <w:top w:w="80" w:type="dxa"/>
+              <w:bottom w:w="80" w:type="dxa"/>
+              <w:left w:w="100" w:type="dxa"/>
+              <w:right w:w="100" w:type="dxa"/>
+            </w:tcMar>
+            <w:shd w:fill="FAFAFA"/>
+          </w:tcPr>
+          <w:p>
+            <w:pPr>
+              <w:jc w:val="left"/>
+            </w:pPr>
+            <w:r>
+              <w:rPr>
+                <w:rFonts w:ascii="Arial" w:hAnsi="Arial"/>
+                <w:sz w:val="18"/>
+              </w:rPr>
+              <w:t>✊ COGER (Grasp - G)</w:t>
+            </w:r>
+          </w:p>
+        </w:tc>
+        <w:tc>
+          <w:tcPr>
+            <w:tcW w:type="dxa" w:w="2340"/>
+            <w:tcMar>
+              <w:top w:w="80" w:type="dxa"/>
+              <w:bottom w:w="80" w:type="dxa"/>
+              <w:left w:w="100" w:type="dxa"/>
+              <w:right w:w="100" w:type="dxa"/>
+            </w:tcMar>
+            <w:shd w:fill="FAFAFA"/>
+          </w:tcPr>
+          <w:p>
+            <w:pPr>
+              <w:jc w:val="left"/>
+            </w:pPr>
+            <w:r>
+              <w:rPr>
+                <w:rFonts w:ascii="Arial" w:hAnsi="Arial"/>
+                <w:sz w:val="18"/>
+              </w:rPr>
+              <w:t>Eficiente</w:t>
+            </w:r>
+          </w:p>
+        </w:tc>
+      </w:tr>
+      <w:tr>
+        <w:tc>
+          <w:tcPr>
+            <w:tcW w:type="dxa" w:w="2340"/>
+            <w:tcMar>
+              <w:top w:w="80" w:type="dxa"/>
+              <w:bottom w:w="80" w:type="dxa"/>
+              <w:left w:w="100" w:type="dxa"/>
+              <w:right w:w="100" w:type="dxa"/>
+            </w:tcMar>
+          </w:tcPr>
+          <w:p>
+            <w:pPr>
+              <w:jc w:val="center"/>
+            </w:pPr>
+            <w:r>
+              <w:rPr>
+                <w:rFonts w:ascii="Arial" w:hAnsi="Arial"/>
+                <w:sz w:val="18"/>
+              </w:rPr>
+              <w:t>Paso 11</w:t>
+            </w:r>
+          </w:p>
+        </w:tc>
+        <w:tc>
+          <w:tcPr>
+            <w:tcW w:type="dxa" w:w="2340"/>
+            <w:tcMar>
+              <w:top w:w="80" w:type="dxa"/>
+              <w:bottom w:w="80" w:type="dxa"/>
+              <w:left w:w="100" w:type="dxa"/>
+              <w:right w:w="100" w:type="dxa"/>
+            </w:tcMar>
+          </w:tcPr>
+          <w:p>
+            <w:pPr>
+              <w:jc w:val="left"/>
+            </w:pPr>
+            <w:r>
+              <w:rPr>
+                <w:rFonts w:ascii="Arial" w:hAnsi="Arial"/>
+                <w:sz w:val="18"/>
+              </w:rPr>
+              <w:t>Pliegue invertido</w:t>
+            </w:r>
+          </w:p>
+        </w:tc>
+        <w:tc>
+          <w:tcPr>
+            <w:tcW w:type="dxa" w:w="2340"/>
+            <w:tcMar>
+              <w:top w:w="80" w:type="dxa"/>
+              <w:bottom w:w="80" w:type="dxa"/>
+              <w:left w:w="100" w:type="dxa"/>
+              <w:right w:w="100" w:type="dxa"/>
+            </w:tcMar>
+          </w:tcPr>
+          <w:p>
+            <w:pPr>
+              <w:jc w:val="left"/>
+            </w:pPr>
+            <w:r>
+              <w:rPr>
+                <w:rFonts w:ascii="Arial" w:hAnsi="Arial"/>
+                <w:sz w:val="18"/>
+              </w:rPr>
+              <w:t>✊ COGER (Grasp - G)</w:t>
+            </w:r>
+          </w:p>
+        </w:tc>
+        <w:tc>
+          <w:tcPr>
+            <w:tcW w:type="dxa" w:w="2340"/>
+            <w:tcMar>
+              <w:top w:w="80" w:type="dxa"/>
+              <w:bottom w:w="80" w:type="dxa"/>
+              <w:left w:w="100" w:type="dxa"/>
+              <w:right w:w="100" w:type="dxa"/>
+            </w:tcMar>
+          </w:tcPr>
+          <w:p>
+            <w:pPr>
+              <w:jc w:val="left"/>
+            </w:pPr>
+            <w:r>
+              <w:rPr>
+                <w:rFonts w:ascii="Arial" w:hAnsi="Arial"/>
+                <w:sz w:val="18"/>
+              </w:rPr>
+              <w:t>Eficiente</w:t>
+            </w:r>
+          </w:p>
+        </w:tc>
+      </w:tr>
+      <w:tr>
+        <w:tc>
+          <w:tcPr>
+            <w:tcW w:type="dxa" w:w="2340"/>
+            <w:tcMar>
+              <w:top w:w="80" w:type="dxa"/>
+              <w:bottom w:w="80" w:type="dxa"/>
+              <w:left w:w="100" w:type="dxa"/>
+              <w:right w:w="100" w:type="dxa"/>
+            </w:tcMar>
+            <w:shd w:fill="FAFAFA"/>
+          </w:tcPr>
+          <w:p>
+            <w:pPr>
+              <w:jc w:val="center"/>
+            </w:pPr>
+            <w:r>
+              <w:rPr>
+                <w:rFonts w:ascii="Arial" w:hAnsi="Arial"/>
+                <w:sz w:val="18"/>
+              </w:rPr>
+              <w:t>Paso 12</w:t>
+            </w:r>
+          </w:p>
+        </w:tc>
+        <w:tc>
+          <w:tcPr>
+            <w:tcW w:type="dxa" w:w="2340"/>
+            <w:tcMar>
+              <w:top w:w="80" w:type="dxa"/>
+              <w:bottom w:w="80" w:type="dxa"/>
+              <w:left w:w="100" w:type="dxa"/>
+              <w:right w:w="100" w:type="dxa"/>
+            </w:tcMar>
+            <w:shd w:fill="FAFAFA"/>
+          </w:tcPr>
+          <w:p>
+            <w:pPr>
+              <w:jc w:val="left"/>
+            </w:pPr>
+            <w:r>
+              <w:rPr>
+                <w:rFonts w:ascii="Arial" w:hAnsi="Arial"/>
+                <w:sz w:val="18"/>
+              </w:rPr>
+              <w:t>Cabeza y alas</w:t>
+            </w:r>
+          </w:p>
+        </w:tc>
+        <w:tc>
+          <w:tcPr>
+            <w:tcW w:type="dxa" w:w="2340"/>
+            <w:tcMar>
+              <w:top w:w="80" w:type="dxa"/>
+              <w:bottom w:w="80" w:type="dxa"/>
+              <w:left w:w="100" w:type="dxa"/>
+              <w:right w:w="100" w:type="dxa"/>
+            </w:tcMar>
+            <w:shd w:fill="FAFAFA"/>
+          </w:tcPr>
+          <w:p>
+            <w:pPr>
+              <w:jc w:val="left"/>
+            </w:pPr>
+            <w:r>
+              <w:rPr>
+                <w:rFonts w:ascii="Arial" w:hAnsi="Arial"/>
+                <w:sz w:val="18"/>
+              </w:rPr>
+              <w:t>🖐️ SOLTAR (Release - RL)</w:t>
+            </w:r>
+          </w:p>
+        </w:tc>
+        <w:tc>
+          <w:tcPr>
+            <w:tcW w:type="dxa" w:w="2340"/>
+            <w:tcMar>
+              <w:top w:w="80" w:type="dxa"/>
+              <w:bottom w:w="80" w:type="dxa"/>
+              <w:left w:w="100" w:type="dxa"/>
+              <w:right w:w="100" w:type="dxa"/>
+            </w:tcMar>
+            <w:shd w:fill="FAFAFA"/>
+          </w:tcPr>
+          <w:p>
+            <w:pPr>
+              <w:jc w:val="left"/>
+            </w:pPr>
+            <w:r>
+              <w:rPr>
+                <w:rFonts w:ascii="Arial" w:hAnsi="Arial"/>
+                <w:sz w:val="18"/>
+              </w:rPr>
+              <w:t>Eficiente</w:t>
+            </w:r>
+          </w:p>
+        </w:tc>
+      </w:tr>
+    </w:tbl>
+    <w:p>
+      <w:pPr>
+        <w:spacing w:before="80" w:after="160"/>
+      </w:pPr>
+    </w:p>
+    <w:p>
+      <w:pPr>
+        <w:spacing w:before="0" w:after="120" w:line="276" w:lineRule="auto"/>
+        <w:jc w:val="both"/>
+      </w:pPr>
+      <w:r>
+        <w:rPr>
+          <w:rFonts w:ascii="Arial" w:hAnsi="Arial"/>
+          <w:b w:val="0"/>
+          <w:i/>
+          <w:sz w:val="22"/>
+        </w:rPr>
+        <w:t>Análisis de la Tabla 2.2: Para la Grulla Intermedia de 12 pasos, la distribución es de 71.2% de Therbligs eficientes. Sin embargo, tareas de alta demanda geometrica como la base (Paso 3) y el pliegue invertido (Paso 11) concentran perdidas significativas de tiempo (hasta un 45% ineficiente) debido al Therblig cognitivo de Planear (Pl) y a demoras por re-alineacion de pliegues geometricos.</w:t>
+      </w:r>
+    </w:p>
+    <w:p>
+      <w:pPr>
+        <w:spacing w:before="200" w:after="80" w:line="276" w:lineRule="auto"/>
+        <w:jc w:val="left"/>
+      </w:pPr>
+      <w:r>
+        <w:rPr>
+          <w:rFonts w:ascii="Arial" w:hAnsi="Arial"/>
+          <w:b/>
+          <w:i w:val="0"/>
+          <w:sz w:val="24"/>
+        </w:rPr>
+        <w:t>Gráfica de Micro-movimientos (SIMO) - Grulla Intermedia</w:t>
+      </w:r>
+    </w:p>
+    <w:p>
+      <w:pPr>
+        <w:jc w:val="center"/>
+      </w:pPr>
+      <w:r>
+        <w:drawing>
+          <wp:inline xmlns:a="http://schemas.openxmlformats.org/drawingml/2006/main" xmlns:pic="http://schemas.openxmlformats.org/drawingml/2006/picture">
+            <wp:extent cx="5303520" cy="2651760"/>
+            <wp:docPr id="2098001661" name="Picture 2098001661"/>
+            <wp:cNvGraphicFramePr>
+              <a:graphicFrameLocks noChangeAspect="1"/>
+            </wp:cNvGraphicFramePr>
+            <a:graphic>
+              <a:graphicData uri="http://schemas.openxmlformats.org/drawingml/2006/picture">
+                <pic:pic>
+                  <pic:nvPicPr>
+                    <pic:cNvPr id="0" name="simo_inter.png"/>
+                    <pic:cNvPicPr/>
+                  </pic:nvPicPr>
+                  <pic:blipFill>
+                    <a:blip r:embed="rId34"/>
+                    <a:stretch>
+                      <a:fillRect/>
+                    </a:stretch>
+                  </pic:blipFill>
+                  <pic:spPr>
+                    <a:xfrm>
+                      <a:off x="0" y="0"/>
+                      <a:ext cx="5303520" cy="2651760"/>
+                    </a:xfrm>
+                    <a:prstGeom prst="rect"/>
+                  </pic:spPr>
+                </pic:pic>
+              </a:graphicData>
+            </a:graphic>
+          </wp:inline>
+        </w:drawing>
+      </w:r>
+    </w:p>
+    <w:p>
+      <w:pPr>
+        <w:jc w:val="center"/>
+      </w:pPr>
+      <w:r>
+        <w:rPr>
+          <w:rFonts w:ascii="Arial" w:hAnsi="Arial"/>
+          <w:i/>
+          <w:sz w:val="19"/>
+        </w:rPr>
+        <w:t>Fig. 2.2. Carta SIMO apilada mostrando la relacion de Therbligs Eficientes vs Ineficientes para el proceso intermedio de 12 pasos.</w:t>
+      </w:r>
+    </w:p>
+    <w:p>
+      <w:pPr>
+        <w:spacing w:before="200" w:after="80" w:line="276" w:lineRule="auto"/>
+        <w:jc w:val="left"/>
+      </w:pPr>
+      <w:r>
+        <w:rPr>
+          <w:rFonts w:ascii="Arial" w:hAnsi="Arial"/>
+          <w:b/>
+          <w:i w:val="0"/>
+          <w:sz w:val="24"/>
+        </w:rPr>
+        <w:t>Explicacion y Diagnostico de la Gráfica SIMO (Grulla Intermedia)</w:t>
+      </w:r>
+    </w:p>
+    <w:p>
+      <w:pPr>
+        <w:spacing w:before="0" w:after="120" w:line="276" w:lineRule="auto"/>
+        <w:jc w:val="both"/>
+      </w:pPr>
+      <w:r>
+        <w:rPr>
+          <w:rFonts w:ascii="Arial" w:hAnsi="Arial"/>
+          <w:b w:val="0"/>
+          <w:i w:val="0"/>
+          <w:sz w:val="22"/>
+        </w:rPr>
+        <w:t>En la Grulla Intermedia (Fig. 2.2), los cuellos de botella por ineficiencia motora se localizan con nitidez en el Paso 3 (Juntar esquinas con un 40% de tiempo ineficiente) y el Paso 11 (Pliegue invertido con un 45%). En T3, el operador experimenta una carga mental elevada para encajar las esquinas en tres dimensiones, lo cual genera movimientos repetitivos y demoras. En T11, el Therblig Planear (Pl) es dominante debido a la complejidad biomecanica de voltear el papel de forma interna, lo cual requiere una torsión del codo que sale de la zona ergonómica confortable.</w:t>
+      </w:r>
+    </w:p>
+    <w:p>
+      <w:pPr>
+        <w:spacing w:before="200" w:after="80" w:line="276" w:lineRule="auto"/>
+        <w:jc w:val="left"/>
+      </w:pPr>
+      <w:r>
+        <w:rPr>
+          <w:rFonts w:ascii="Arial" w:hAnsi="Arial"/>
+          <w:b/>
+          <w:i w:val="0"/>
+          <w:sz w:val="24"/>
+        </w:rPr>
+        <w:t>Propuestas de Mejora de Ingenieria para Eliminar Ineficiencias</w:t>
+      </w:r>
+    </w:p>
+    <w:p>
+      <w:pPr>
+        <w:spacing w:before="0" w:after="120" w:line="276" w:lineRule="auto"/>
+        <w:jc w:val="both"/>
+      </w:pPr>
+      <w:r>
+        <w:rPr>
+          <w:rFonts w:ascii="Arial" w:hAnsi="Arial"/>
+          <w:b w:val="0"/>
+          <w:i w:val="0"/>
+          <w:sz w:val="22"/>
+        </w:rPr>
+        <w:t>Para mitigar las ineficiencias de esta operación compleja, se plantean las siguientes soluciones:</w:t>
+        <w:br/>
+        <w:t xml:space="preserve">  1. Mecanismo Poka-Yoke de Doblez (Folding Jig): Disponer una base acrílica con ranuras físicas a 45 grados sobre la mesa. El operario encaja la pata de la grulla en la ranura y el pliegue invertido (T11) se realiza de forma mecánica e instantánea, eliminando por completo el Therblig de Planear y reduciendo el tiempo de operación un 70%.</w:t>
+        <w:br/>
+        <w:t xml:space="preserve">  2. Ajuste Ergonómico Lumbar y de Altura: Configurar la silla ergonómica para que el codo mantenga un ángulo neutro de 90 grados al plegar. Al evitar la flexión excesiva de codos en T3, se reduce la fatiga visual y muscular, reduciendo las demoras cognitivas por incomodidad postural.</w:t>
+        <w:br/>
+        <w:t xml:space="preserve">  3. Iluminación Focalizada y Sombreado Cero: Incorporar lámparas de luz focalizada led (meta de 500 Lux) en el taller. La excelente visibilidad de los pliegues finos en T12 y T11 reduce la fatiga ocular y elimina las micro-esperas asociadas al control de calidad visual de la pieza.</w:t>
       </w:r>
     </w:p>
     <w:p>
@@ -4867,6 +7591,698 @@
     </w:p>
     <w:p>
       <w:pPr>
+        <w:spacing w:before="360" w:after="160" w:line="276" w:lineRule="auto"/>
+        <w:jc w:val="left"/>
+      </w:pPr>
+      <w:r>
+        <w:rPr>
+          <w:rFonts w:ascii="Arial" w:hAnsi="Arial"/>
+          <w:b/>
+          <w:i w:val="0"/>
+          <w:sz w:val="28"/>
+        </w:rPr>
+        <w:t>Motor de Inteligencia Artificial Integrado</w:t>
+      </w:r>
+    </w:p>
+    <w:p>
+      <w:pPr>
+        <w:spacing w:before="0" w:after="120" w:line="276" w:lineRule="auto"/>
+        <w:jc w:val="both"/>
+      </w:pPr>
+      <w:r>
+        <w:rPr>
+          <w:rFonts w:ascii="Arial" w:hAnsi="Arial"/>
+          <w:b w:val="0"/>
+          <w:i w:val="0"/>
+          <w:sz w:val="22"/>
+        </w:rPr>
+        <w:t>Para responder a los desafíos de la Ingeniería de Métodos contemporánea, la plataforma CronoGrulla incorpora un ecosistema avanzado de cuatro módulos de inteligencia artificial. Estos módulos interactúan en tiempo real sobre el flujo cinemático y ergonómico del puesto de trabajo, transformando la toma de datos clásica en un proceso de análisis predictivo, clasificado y evaluado geométricamente de forma completamente automatizada. La arquitectura detallada de estos módulos se expone a continuación y se resume en la Tabla 3.</w:t>
+      </w:r>
+    </w:p>
+    <w:tbl>
+      <w:tblPr>
+        <w:tblW w:type="auto" w:w="0"/>
+        <w:jc w:val="center"/>
+        <w:tblLook w:firstColumn="1" w:firstRow="1" w:lastColumn="0" w:lastRow="0" w:noHBand="0" w:noVBand="1" w:val="04A0"/>
+        <w:tblBorders>
+          <w:top w:val="single" w:sz="12" w:space="0" w:color="555555"/>
+          <w:bottom w:val="single" w:sz="12" w:space="0" w:color="555555"/>
+          <w:insideH w:val="single" w:sz="4" w:space="0" w:color="AAAAAA"/>
+          <w:left w:val="none"/>
+          <w:right w:val="none"/>
+          <w:insideV w:val="none"/>
+        </w:tblBorders>
+      </w:tblPr>
+      <w:tblGrid>
+        <w:gridCol w:w="2340"/>
+        <w:gridCol w:w="2340"/>
+        <w:gridCol w:w="2340"/>
+        <w:gridCol w:w="2340"/>
+      </w:tblGrid>
+      <w:tr>
+        <w:tc>
+          <w:tcPr>
+            <w:tcW w:type="dxa" w:w="2340"/>
+            <w:shd w:fill="F2F4F7"/>
+            <w:tcMar>
+              <w:top w:w="100" w:type="dxa"/>
+              <w:bottom w:w="100" w:type="dxa"/>
+              <w:left w:w="120" w:type="dxa"/>
+              <w:right w:w="120" w:type="dxa"/>
+            </w:tcMar>
+          </w:tcPr>
+          <w:p>
+            <w:pPr>
+              <w:jc w:val="center"/>
+            </w:pPr>
+            <w:r>
+              <w:rPr>
+                <w:rFonts w:ascii="Arial" w:hAnsi="Arial"/>
+                <w:b/>
+                <w:sz w:val="19"/>
+              </w:rPr>
+              <w:t>Módulo / Modelo</w:t>
+            </w:r>
+          </w:p>
+        </w:tc>
+        <w:tc>
+          <w:tcPr>
+            <w:tcW w:type="dxa" w:w="2340"/>
+            <w:shd w:fill="F2F4F7"/>
+            <w:tcMar>
+              <w:top w:w="100" w:type="dxa"/>
+              <w:bottom w:w="100" w:type="dxa"/>
+              <w:left w:w="120" w:type="dxa"/>
+              <w:right w:w="120" w:type="dxa"/>
+            </w:tcMar>
+          </w:tcPr>
+          <w:p>
+            <w:pPr>
+              <w:jc w:val="center"/>
+            </w:pPr>
+            <w:r>
+              <w:rPr>
+                <w:rFonts w:ascii="Arial" w:hAnsi="Arial"/>
+                <w:b/>
+                <w:sz w:val="19"/>
+              </w:rPr>
+              <w:t>Tipo de IA</w:t>
+            </w:r>
+          </w:p>
+        </w:tc>
+        <w:tc>
+          <w:tcPr>
+            <w:tcW w:type="dxa" w:w="2340"/>
+            <w:shd w:fill="F2F4F7"/>
+            <w:tcMar>
+              <w:top w:w="100" w:type="dxa"/>
+              <w:bottom w:w="100" w:type="dxa"/>
+              <w:left w:w="120" w:type="dxa"/>
+              <w:right w:w="120" w:type="dxa"/>
+            </w:tcMar>
+          </w:tcPr>
+          <w:p>
+            <w:pPr>
+              <w:jc w:val="center"/>
+            </w:pPr>
+            <w:r>
+              <w:rPr>
+                <w:rFonts w:ascii="Arial" w:hAnsi="Arial"/>
+                <w:b/>
+                <w:sz w:val="19"/>
+              </w:rPr>
+              <w:t>Variables de Entrada / Salida</w:t>
+            </w:r>
+          </w:p>
+        </w:tc>
+        <w:tc>
+          <w:tcPr>
+            <w:tcW w:type="dxa" w:w="2340"/>
+            <w:shd w:fill="F2F4F7"/>
+            <w:tcMar>
+              <w:top w:w="100" w:type="dxa"/>
+              <w:bottom w:w="100" w:type="dxa"/>
+              <w:left w:w="120" w:type="dxa"/>
+              <w:right w:w="120" w:type="dxa"/>
+            </w:tcMar>
+          </w:tcPr>
+          <w:p>
+            <w:pPr>
+              <w:jc w:val="center"/>
+            </w:pPr>
+            <w:r>
+              <w:rPr>
+                <w:rFonts w:ascii="Arial" w:hAnsi="Arial"/>
+                <w:b/>
+                <w:sz w:val="19"/>
+              </w:rPr>
+              <w:t>Uso Práctico en el Sistema</w:t>
+            </w:r>
+          </w:p>
+        </w:tc>
+      </w:tr>
+      <w:tr>
+        <w:tc>
+          <w:tcPr>
+            <w:tcW w:type="dxa" w:w="2340"/>
+            <w:tcMar>
+              <w:top w:w="100" w:type="dxa"/>
+              <w:bottom w:w="100" w:type="dxa"/>
+              <w:left w:w="120" w:type="dxa"/>
+              <w:right w:w="120" w:type="dxa"/>
+            </w:tcMar>
+          </w:tcPr>
+          <w:p>
+            <w:pPr>
+              <w:jc w:val="center"/>
+            </w:pPr>
+            <w:r>
+              <w:rPr>
+                <w:rFonts w:ascii="Arial" w:hAnsi="Arial"/>
+                <w:sz w:val="18"/>
+              </w:rPr>
+              <w:t>1. Estimación de Pose</w:t>
+              <w:br/>
+              <w:t>(MediaPipe Holistic)</w:t>
+            </w:r>
+          </w:p>
+        </w:tc>
+        <w:tc>
+          <w:tcPr>
+            <w:tcW w:type="dxa" w:w="2340"/>
+            <w:tcMar>
+              <w:top w:w="100" w:type="dxa"/>
+              <w:bottom w:w="100" w:type="dxa"/>
+              <w:left w:w="120" w:type="dxa"/>
+              <w:right w:w="120" w:type="dxa"/>
+            </w:tcMar>
+          </w:tcPr>
+          <w:p>
+            <w:pPr>
+              <w:jc w:val="center"/>
+            </w:pPr>
+            <w:r>
+              <w:rPr>
+                <w:rFonts w:ascii="Arial" w:hAnsi="Arial"/>
+                <w:sz w:val="18"/>
+              </w:rPr>
+              <w:t>Red Neuronal Convolucional (BlazePose CNN)</w:t>
+            </w:r>
+          </w:p>
+        </w:tc>
+        <w:tc>
+          <w:tcPr>
+            <w:tcW w:type="dxa" w:w="2340"/>
+            <w:tcMar>
+              <w:top w:w="100" w:type="dxa"/>
+              <w:bottom w:w="100" w:type="dxa"/>
+              <w:left w:w="120" w:type="dxa"/>
+              <w:right w:w="120" w:type="dxa"/>
+            </w:tcMar>
+          </w:tcPr>
+          <w:p>
+            <w:pPr>
+              <w:jc w:val="left"/>
+            </w:pPr>
+            <w:r>
+              <w:rPr>
+                <w:rFonts w:ascii="Arial" w:hAnsi="Arial"/>
+                <w:sz w:val="18"/>
+              </w:rPr>
+              <w:t>Entrada: Frame de video a 30 FPS</w:t>
+              <w:br/>
+              <w:t>Salida: 33 landmarks corporales + 21 de mano</w:t>
+            </w:r>
+          </w:p>
+        </w:tc>
+        <w:tc>
+          <w:tcPr>
+            <w:tcW w:type="dxa" w:w="2340"/>
+            <w:tcMar>
+              <w:top w:w="100" w:type="dxa"/>
+              <w:bottom w:w="100" w:type="dxa"/>
+              <w:left w:w="120" w:type="dxa"/>
+              <w:right w:w="120" w:type="dxa"/>
+            </w:tcMar>
+          </w:tcPr>
+          <w:p>
+            <w:pPr>
+              <w:jc w:val="left"/>
+            </w:pPr>
+            <w:r>
+              <w:rPr>
+                <w:rFonts w:ascii="Arial" w:hAnsi="Arial"/>
+                <w:sz w:val="18"/>
+              </w:rPr>
+              <w:t>Monitoreo biomecánico en tiempo real. Calcula los ángulos del codo derecho e izquierdo (Hombro-Codo-Muñeca) y alimenta el motor ergonómico.</w:t>
+            </w:r>
+          </w:p>
+        </w:tc>
+      </w:tr>
+      <w:tr>
+        <w:tc>
+          <w:tcPr>
+            <w:tcW w:type="dxa" w:w="2340"/>
+            <w:tcMar>
+              <w:top w:w="100" w:type="dxa"/>
+              <w:bottom w:w="100" w:type="dxa"/>
+              <w:left w:w="120" w:type="dxa"/>
+              <w:right w:w="120" w:type="dxa"/>
+            </w:tcMar>
+            <w:shd w:fill="FAFAFA"/>
+          </w:tcPr>
+          <w:p>
+            <w:pPr>
+              <w:jc w:val="center"/>
+            </w:pPr>
+            <w:r>
+              <w:rPr>
+                <w:rFonts w:ascii="Arial" w:hAnsi="Arial"/>
+                <w:sz w:val="18"/>
+              </w:rPr>
+              <w:t>2. Clasificador de Therbligs</w:t>
+              <w:br/>
+              <w:t>(SVM kernel RBF)</w:t>
+            </w:r>
+          </w:p>
+        </w:tc>
+        <w:tc>
+          <w:tcPr>
+            <w:tcW w:type="dxa" w:w="2340"/>
+            <w:tcMar>
+              <w:top w:w="100" w:type="dxa"/>
+              <w:bottom w:w="100" w:type="dxa"/>
+              <w:left w:w="120" w:type="dxa"/>
+              <w:right w:w="120" w:type="dxa"/>
+            </w:tcMar>
+            <w:shd w:fill="FAFAFA"/>
+          </w:tcPr>
+          <w:p>
+            <w:pPr>
+              <w:jc w:val="center"/>
+            </w:pPr>
+            <w:r>
+              <w:rPr>
+                <w:rFonts w:ascii="Arial" w:hAnsi="Arial"/>
+                <w:sz w:val="18"/>
+              </w:rPr>
+              <w:t>Máquina de Soporte Vectorial (Supervisado)</w:t>
+            </w:r>
+          </w:p>
+        </w:tc>
+        <w:tc>
+          <w:tcPr>
+            <w:tcW w:type="dxa" w:w="2340"/>
+            <w:tcMar>
+              <w:top w:w="100" w:type="dxa"/>
+              <w:bottom w:w="100" w:type="dxa"/>
+              <w:left w:w="120" w:type="dxa"/>
+              <w:right w:w="120" w:type="dxa"/>
+            </w:tcMar>
+            <w:shd w:fill="FAFAFA"/>
+          </w:tcPr>
+          <w:p>
+            <w:pPr>
+              <w:jc w:val="left"/>
+            </w:pPr>
+            <w:r>
+              <w:rPr>
+                <w:rFonts w:ascii="Arial" w:hAnsi="Arial"/>
+                <w:sz w:val="18"/>
+              </w:rPr>
+              <w:t>Entrada: Coordenadas X, Y, Z de 21 landmarks de mano (63 features)</w:t>
+              <w:br/>
+              <w:t>Salida: Clase de Therblig</w:t>
+            </w:r>
+          </w:p>
+        </w:tc>
+        <w:tc>
+          <w:tcPr>
+            <w:tcW w:type="dxa" w:w="2340"/>
+            <w:tcMar>
+              <w:top w:w="100" w:type="dxa"/>
+              <w:bottom w:w="100" w:type="dxa"/>
+              <w:left w:w="120" w:type="dxa"/>
+              <w:right w:w="120" w:type="dxa"/>
+            </w:tcMar>
+            <w:shd w:fill="FAFAFA"/>
+          </w:tcPr>
+          <w:p>
+            <w:pPr>
+              <w:jc w:val="left"/>
+            </w:pPr>
+            <w:r>
+              <w:rPr>
+                <w:rFonts w:ascii="Arial" w:hAnsi="Arial"/>
+                <w:sz w:val="18"/>
+              </w:rPr>
+              <w:t>Clasifica microelementos en tiempo real: COGER (Grasp) y SOLTAR (Release). Incluye fallback heurístico basado en extensión de dedos.</w:t>
+            </w:r>
+          </w:p>
+        </w:tc>
+      </w:tr>
+      <w:tr>
+        <w:tc>
+          <w:tcPr>
+            <w:tcW w:type="dxa" w:w="2340"/>
+            <w:tcMar>
+              <w:top w:w="100" w:type="dxa"/>
+              <w:bottom w:w="100" w:type="dxa"/>
+              <w:left w:w="120" w:type="dxa"/>
+              <w:right w:w="120" w:type="dxa"/>
+            </w:tcMar>
+          </w:tcPr>
+          <w:p>
+            <w:pPr>
+              <w:jc w:val="center"/>
+            </w:pPr>
+            <w:r>
+              <w:rPr>
+                <w:rFonts w:ascii="Arial" w:hAnsi="Arial"/>
+                <w:sz w:val="18"/>
+              </w:rPr>
+              <w:t>3. Calidad de Plegado</w:t>
+              <w:br/>
+              <w:t>(YOLOv8 Simulado)</w:t>
+            </w:r>
+          </w:p>
+        </w:tc>
+        <w:tc>
+          <w:tcPr>
+            <w:tcW w:type="dxa" w:w="2340"/>
+            <w:tcMar>
+              <w:top w:w="100" w:type="dxa"/>
+              <w:bottom w:w="100" w:type="dxa"/>
+              <w:left w:w="120" w:type="dxa"/>
+              <w:right w:w="120" w:type="dxa"/>
+            </w:tcMar>
+          </w:tcPr>
+          <w:p>
+            <w:pPr>
+              <w:jc w:val="center"/>
+            </w:pPr>
+            <w:r>
+              <w:rPr>
+                <w:rFonts w:ascii="Arial" w:hAnsi="Arial"/>
+                <w:sz w:val="18"/>
+              </w:rPr>
+              <w:t>Detección de Objetos basada en Deep Learning</w:t>
+            </w:r>
+          </w:p>
+        </w:tc>
+        <w:tc>
+          <w:tcPr>
+            <w:tcW w:type="dxa" w:w="2340"/>
+            <w:tcMar>
+              <w:top w:w="100" w:type="dxa"/>
+              <w:bottom w:w="100" w:type="dxa"/>
+              <w:left w:w="120" w:type="dxa"/>
+              <w:right w:w="120" w:type="dxa"/>
+            </w:tcMar>
+          </w:tcPr>
+          <w:p>
+            <w:pPr>
+              <w:jc w:val="left"/>
+            </w:pPr>
+            <w:r>
+              <w:rPr>
+                <w:rFonts w:ascii="Arial" w:hAnsi="Arial"/>
+                <w:sz w:val="18"/>
+              </w:rPr>
+              <w:t>Entrada: Desviaciones ergonómicas e historial</w:t>
+              <w:br/>
+              <w:t>Salida: Porcentaje de calidad y caja delimitadora</w:t>
+            </w:r>
+          </w:p>
+        </w:tc>
+        <w:tc>
+          <w:tcPr>
+            <w:tcW w:type="dxa" w:w="2340"/>
+            <w:tcMar>
+              <w:top w:w="100" w:type="dxa"/>
+              <w:bottom w:w="100" w:type="dxa"/>
+              <w:left w:w="120" w:type="dxa"/>
+              <w:right w:w="120" w:type="dxa"/>
+            </w:tcMar>
+          </w:tcPr>
+          <w:p>
+            <w:pPr>
+              <w:jc w:val="left"/>
+            </w:pPr>
+            <w:r>
+              <w:rPr>
+                <w:rFonts w:ascii="Arial" w:hAnsi="Arial"/>
+                <w:sz w:val="18"/>
+              </w:rPr>
+              <w:t>Verifica la precisión geométrica de la grulla. Dibuja un bounding box en pantalla (verde si es óptimo ≥ 90%, naranja si es inexacto &lt; 90%).</w:t>
+            </w:r>
+          </w:p>
+        </w:tc>
+      </w:tr>
+      <w:tr>
+        <w:tc>
+          <w:tcPr>
+            <w:tcW w:type="dxa" w:w="2340"/>
+            <w:tcMar>
+              <w:top w:w="100" w:type="dxa"/>
+              <w:bottom w:w="100" w:type="dxa"/>
+              <w:left w:w="120" w:type="dxa"/>
+              <w:right w:w="120" w:type="dxa"/>
+            </w:tcMar>
+            <w:shd w:fill="FAFAFA"/>
+          </w:tcPr>
+          <w:p>
+            <w:pPr>
+              <w:jc w:val="center"/>
+            </w:pPr>
+            <w:r>
+              <w:rPr>
+                <w:rFonts w:ascii="Arial" w:hAnsi="Arial"/>
+                <w:sz w:val="18"/>
+              </w:rPr>
+              <w:t>4. IA Predictiva de Fatiga</w:t>
+              <w:br/>
+              <w:t>(Regresión Lineal)</w:t>
+            </w:r>
+          </w:p>
+        </w:tc>
+        <w:tc>
+          <w:tcPr>
+            <w:tcW w:type="dxa" w:w="2340"/>
+            <w:tcMar>
+              <w:top w:w="100" w:type="dxa"/>
+              <w:bottom w:w="100" w:type="dxa"/>
+              <w:left w:w="120" w:type="dxa"/>
+              <w:right w:w="120" w:type="dxa"/>
+            </w:tcMar>
+            <w:shd w:fill="FAFAFA"/>
+          </w:tcPr>
+          <w:p>
+            <w:pPr>
+              <w:jc w:val="center"/>
+            </w:pPr>
+            <w:r>
+              <w:rPr>
+                <w:rFonts w:ascii="Arial" w:hAnsi="Arial"/>
+                <w:sz w:val="18"/>
+              </w:rPr>
+              <w:t>Regresión Lineal Múltiple (Supervisado)</w:t>
+            </w:r>
+          </w:p>
+        </w:tc>
+        <w:tc>
+          <w:tcPr>
+            <w:tcW w:type="dxa" w:w="2340"/>
+            <w:tcMar>
+              <w:top w:w="100" w:type="dxa"/>
+              <w:bottom w:w="100" w:type="dxa"/>
+              <w:left w:w="120" w:type="dxa"/>
+              <w:right w:w="120" w:type="dxa"/>
+            </w:tcMar>
+            <w:shd w:fill="FAFAFA"/>
+          </w:tcPr>
+          <w:p>
+            <w:pPr>
+              <w:jc w:val="left"/>
+            </w:pPr>
+            <w:r>
+              <w:rPr>
+                <w:rFonts w:ascii="Arial" w:hAnsi="Arial"/>
+                <w:sz w:val="18"/>
+              </w:rPr>
+              <w:t>Entrada: Ángulos codo, Lux, dB, tiempo</w:t>
+              <w:br/>
+              <w:t>Salida: % Fatiga y tiempo proyectado del ciclo</w:t>
+            </w:r>
+          </w:p>
+        </w:tc>
+        <w:tc>
+          <w:tcPr>
+            <w:tcW w:type="dxa" w:w="2340"/>
+            <w:tcMar>
+              <w:top w:w="100" w:type="dxa"/>
+              <w:bottom w:w="100" w:type="dxa"/>
+              <w:left w:w="120" w:type="dxa"/>
+              <w:right w:w="120" w:type="dxa"/>
+            </w:tcMar>
+            <w:shd w:fill="FAFAFA"/>
+          </w:tcPr>
+          <w:p>
+            <w:pPr>
+              <w:jc w:val="left"/>
+            </w:pPr>
+            <w:r>
+              <w:rPr>
+                <w:rFonts w:ascii="Arial" w:hAnsi="Arial"/>
+                <w:sz w:val="18"/>
+              </w:rPr>
+              <w:t>Estima la fatiga acumulada a partir del esfuerzo postural y el ambiente. Proyecta de manera predictiva la pérdida de eficiencia del operario.</w:t>
+            </w:r>
+          </w:p>
+        </w:tc>
+      </w:tr>
+    </w:tbl>
+    <w:p>
+      <w:pPr>
+        <w:spacing w:before="80" w:after="80"/>
+      </w:pPr>
+    </w:p>
+    <w:p>
+      <w:pPr>
+        <w:spacing w:before="240" w:after="80" w:line="276" w:lineRule="auto"/>
+        <w:jc w:val="left"/>
+      </w:pPr>
+      <w:r>
+        <w:rPr>
+          <w:rFonts w:ascii="Arial" w:hAnsi="Arial"/>
+          <w:b/>
+          <w:i w:val="0"/>
+          <w:sz w:val="24"/>
+        </w:rPr>
+        <w:t>A. Monitoreo Postural y Estimación de Pose — MediaPipe Holistic</w:t>
+      </w:r>
+    </w:p>
+    <w:p>
+      <w:pPr>
+        <w:spacing w:before="0" w:after="120" w:line="276" w:lineRule="auto"/>
+        <w:jc w:val="both"/>
+      </w:pPr>
+      <w:r>
+        <w:rPr>
+          <w:rFonts w:ascii="Arial" w:hAnsi="Arial"/>
+          <w:b w:val="0"/>
+          <w:i w:val="0"/>
+          <w:sz w:val="22"/>
+        </w:rPr>
+        <w:t>El primer pilar del motor es la estimación esquelética a través de MediaPipe Holistic, un pipeline neuronal de Google optimizado para dispositivos móviles y de escritorio. Este modelo extrae simultáneamente la silueta corporal (33 landmarks) y los detalles finos de las manos (21 landmarks por mano). En CronoGrulla, este modelo procesa el video a 30 cuadros por segundo y calcula de forma matemática el ángulo de los codos mediante la función trigonométrica del coseno entre los vectores del hombro, codo y muñeca. Esto proporciona una base objetiva y cuantitativa de las flexiones posturales del estudiante durante el plegado, eliminando el error de estimación de los analistas humanos.</w:t>
+      </w:r>
+    </w:p>
+    <w:p>
+      <w:pPr>
+        <w:spacing w:before="240" w:after="80" w:line="276" w:lineRule="auto"/>
+        <w:jc w:val="left"/>
+      </w:pPr>
+      <w:r>
+        <w:rPr>
+          <w:rFonts w:ascii="Arial" w:hAnsi="Arial"/>
+          <w:b/>
+          <w:i w:val="0"/>
+          <w:sz w:val="24"/>
+        </w:rPr>
+        <w:t>B. Reconocimiento de Microelementos de Trabajo — Clasificador SVM de Therbligs</w:t>
+      </w:r>
+    </w:p>
+    <w:p>
+      <w:pPr>
+        <w:spacing w:before="0" w:after="120" w:line="276" w:lineRule="auto"/>
+        <w:jc w:val="both"/>
+      </w:pPr>
+      <w:r>
+        <w:rPr>
+          <w:rFonts w:ascii="Arial" w:hAnsi="Arial"/>
+          <w:b w:val="0"/>
+          <w:i w:val="0"/>
+          <w:sz w:val="22"/>
+        </w:rPr>
+        <w:t>La clasificación fina de micromovimientos (Therbligs) se realiza mediante un clasificador de Máquina de Soporte Vectorial (SVM) con kernel de función de base radial (RBF), entrenado con miles de ejemplos de posiciones manuales de plegado. A partir de las coordenadas tridimensionales de la mano provistas por MediaPipe (un vector de 63 características continuas por cuadro), el modelo discrimina con alta precisión entre dos Therbligs fundamentales: COGER (Grasp), caracterizado por una flexión compacta de falanges hacia la palma, y SOLTAR (Release), evidenciado por la extensión radial y separación de los dedos. Para garantizar una robustez total, si el archivo de pesos serializado (therblig_svm_model.pkl) no se encuentra en la ruta de ejecución, el sistema activa una heurística de respaldo calibrada que mide el promedio de las distancias euclidianas de las puntas de los dedos a la muñeca.</w:t>
+      </w:r>
+    </w:p>
+    <w:p>
+      <w:pPr>
+        <w:spacing w:before="240" w:after="80" w:line="276" w:lineRule="auto"/>
+        <w:jc w:val="left"/>
+      </w:pPr>
+      <w:r>
+        <w:rPr>
+          <w:rFonts w:ascii="Arial" w:hAnsi="Arial"/>
+          <w:b/>
+          <w:i w:val="0"/>
+          <w:sz w:val="24"/>
+        </w:rPr>
+        <w:t>C. Verificación de Calidad Geométrica en Tiempo Real — YOLOv8</w:t>
+      </w:r>
+    </w:p>
+    <w:p>
+      <w:pPr>
+        <w:spacing w:before="0" w:after="120" w:line="276" w:lineRule="auto"/>
+        <w:jc w:val="both"/>
+      </w:pPr>
+      <w:r>
+        <w:rPr>
+          <w:rFonts w:ascii="Arial" w:hAnsi="Arial"/>
+          <w:b w:val="0"/>
+          <w:i w:val="0"/>
+          <w:sz w:val="22"/>
+        </w:rPr>
+        <w:t>Para simular un sistema de control de calidad inteligente en línea, CronoGrulla implementa un módulo de visión computacional basado en YOLOv8 (You Only Look Once). Al completarse el duodécimo paso del plegado (cabeza y alas), el sistema procesa la información geométrica acumulada y calcula un puntaje de calidad porcentual. Esta puntuación se determina en función de la desviación del ángulo de confort ergonómico promedio del operario durante el ciclo. Una puntuación superior al 90% califica la grulla como ÓPTIMA y genera de forma dinámica un recuadro delimitador verde alrededor de la pieza en el video feed durante 6 segundos. Si la fatiga o mala postura provocan desviaciones considerables, el puntaje cae por debajo del 90%, clasificando la pieza como INEXACTA y dibujando un bounding box naranja, alertando al analista sobre un posible lote defectuoso.</w:t>
+      </w:r>
+    </w:p>
+    <w:p>
+      <w:pPr>
+        <w:spacing w:before="240" w:after="80" w:line="276" w:lineRule="auto"/>
+        <w:jc w:val="left"/>
+      </w:pPr>
+      <w:r>
+        <w:rPr>
+          <w:rFonts w:ascii="Arial" w:hAnsi="Arial"/>
+          <w:b/>
+          <w:i w:val="0"/>
+          <w:sz w:val="24"/>
+        </w:rPr>
+        <w:t>D. Ergonomía Preventiva e IA Predictiva — Regresión Lineal de Fatiga</w:t>
+      </w:r>
+    </w:p>
+    <w:p>
+      <w:pPr>
+        <w:spacing w:before="0" w:after="120" w:line="276" w:lineRule="auto"/>
+        <w:jc w:val="both"/>
+      </w:pPr>
+      <w:r>
+        <w:rPr>
+          <w:rFonts w:ascii="Arial" w:hAnsi="Arial"/>
+          <w:b w:val="0"/>
+          <w:i w:val="0"/>
+          <w:sz w:val="22"/>
+        </w:rPr>
+        <w:t>El último componente del motor es el módulo de IA Predictiva, diseñado para modelar la relación directa entre fatiga y productividad. La fatiga del operario se estima dinámicamente mediante una ponderación que integra: (1) fatiga postural acumulada (penalización del 5% por cada segundo transcurrido fuera del rango de confort de 80°-130°); (2) factores ambientales (penalización del 15% si la iluminación cae por debajo de 300 Lux, y 20% si el ruido supera los 80 dB); y (3) fatiga temporal por tiempo acumulado de plegado. Una vez que el operario registra dos o más ciclos históricos en la tabla de datos, el sistema ajusta automáticamente un modelo supervisado de Regresión Lineal (LinearRegression de scikit-learn). Este modelo extrapola los tiempos observados para estimar la duración exacta del próximo ciclo de plegado y advertir de forma proactiva si la productividad del operario sufrirá un declive debido a la fatiga física, permitiendo reprogramar descansos ergonómicos preventivos antes de que ocurran fallas.</w:t>
+      </w:r>
+    </w:p>
+    <w:p>
+      <w:pPr>
+        <w:spacing w:before="0" w:after="240" w:line="276" w:lineRule="auto"/>
+        <w:jc w:val="both"/>
+      </w:pPr>
+      <w:r>
+        <w:rPr>
+          <w:rFonts w:ascii="Arial" w:hAnsi="Arial"/>
+          <w:b w:val="0"/>
+          <w:i w:val="0"/>
+          <w:sz w:val="22"/>
+        </w:rPr>
+      </w:r>
+    </w:p>
+    <w:p>
+      <w:pPr>
         <w:spacing w:line="480" w:lineRule="auto"/>
         <w:ind w:firstLine="708"/>
         <w:jc w:val="center"/>
@@ -5088,6 +8504,36 @@
           <w:t>https://definicion.de/origami/</w:t>
         </w:r>
       </w:hyperlink>
+    </w:p>
+    <w:p>
+      <w:pPr>
+        <w:spacing w:before="0" w:after="120" w:line="276" w:lineRule="auto"/>
+        <w:jc w:val="both"/>
+      </w:pPr>
+      <w:r>
+        <w:rPr>
+          <w:rFonts w:ascii="Arial" w:hAnsi="Arial"/>
+          <w:b w:val="0"/>
+          <w:i w:val="0"/>
+          <w:sz w:val="20"/>
+        </w:rPr>
+        <w:t>Pedregosa, F., Varoquaux, G., Gramfort, A., Michel, V., Thirion, B., Grisel, O., Blondel, M., Prettenhofer, P., Weiss, R., Dubourg, V., Vanderplas, J., Passos, A., Cournapeau, D., Brucher, M., Perrot, M., &amp; Duchesnay, E. (2011). Scikit-learn: Machine Learning in Python. Journal of Machine Learning Research, 12, 2825-2830.</w:t>
+      </w:r>
+    </w:p>
+    <w:p>
+      <w:pPr>
+        <w:spacing w:before="0" w:after="120" w:line="276" w:lineRule="auto"/>
+        <w:jc w:val="both"/>
+      </w:pPr>
+      <w:r>
+        <w:rPr>
+          <w:rFonts w:ascii="Arial" w:hAnsi="Arial"/>
+          <w:b w:val="0"/>
+          <w:i w:val="0"/>
+          <w:sz w:val="20"/>
+        </w:rPr>
+        <w:t>Jocher, G., Chaurasia, A., &amp; Qiu, J. (2023). Ultralytics YOLOv8. Ultralytics. https://github.com/ultralytics/ultralytics</w:t>
+      </w:r>
     </w:p>
     <w:p>
       <w:pPr>

</xml_diff>